<commit_message>
actualizado CFA y agregado video
</commit_message>
<xml_diff>
--- a/fuentes/CFA1_12150026_DU.docx
+++ b/fuentes/CFA1_12150026_DU.docx
@@ -560,7 +560,7 @@
           <w:r>
             <w:fldChar w:fldCharType="separate"/>
           </w:r>
-          <w:hyperlink w:anchor="_Toc211880589" w:history="1">
+          <w:hyperlink w:anchor="_Toc212062719" w:history="1">
             <w:r>
               <w:rPr>
                 <w:rStyle w:val="Hipervnculo"/>
@@ -587,7 +587,7 @@
                 <w:noProof/>
                 <w:webHidden/>
               </w:rPr>
-              <w:instrText xml:space="preserve"> PAGEREF _Toc211880589 \h </w:instrText>
+              <w:instrText xml:space="preserve"> PAGEREF _Toc212062719 \h </w:instrText>
             </w:r>
             <w:r>
               <w:rPr>
@@ -633,7 +633,7 @@
               <w:lang w:eastAsia="es-MX"/>
             </w:rPr>
           </w:pPr>
-          <w:hyperlink w:anchor="_Toc211880590" w:history="1">
+          <w:hyperlink w:anchor="_Toc212062720" w:history="1">
             <w:r>
               <w:rPr>
                 <w:rStyle w:val="Hipervnculo"/>
@@ -677,7 +677,7 @@
                 <w:noProof/>
                 <w:webHidden/>
               </w:rPr>
-              <w:instrText xml:space="preserve"> PAGEREF _Toc211880590 \h </w:instrText>
+              <w:instrText xml:space="preserve"> PAGEREF _Toc212062720 \h </w:instrText>
             </w:r>
             <w:r>
               <w:rPr>
@@ -697,7 +697,7 @@
                 <w:noProof/>
                 <w:webHidden/>
               </w:rPr>
-              <w:t>3</w:t>
+              <w:t>4</w:t>
             </w:r>
             <w:r>
               <w:rPr>
@@ -719,7 +719,7 @@
               <w:lang w:eastAsia="es-MX"/>
             </w:rPr>
           </w:pPr>
-          <w:hyperlink w:anchor="_Toc211880591" w:history="1">
+          <w:hyperlink w:anchor="_Toc212062721" w:history="1">
             <w:r>
               <w:rPr>
                 <w:rStyle w:val="Hipervnculo"/>
@@ -763,7 +763,7 @@
                 <w:noProof/>
                 <w:webHidden/>
               </w:rPr>
-              <w:instrText xml:space="preserve"> PAGEREF _Toc211880591 \h </w:instrText>
+              <w:instrText xml:space="preserve"> PAGEREF _Toc212062721 \h </w:instrText>
             </w:r>
             <w:r>
               <w:rPr>
@@ -783,7 +783,7 @@
                 <w:noProof/>
                 <w:webHidden/>
               </w:rPr>
-              <w:t>3</w:t>
+              <w:t>4</w:t>
             </w:r>
             <w:r>
               <w:rPr>
@@ -805,7 +805,7 @@
               <w:lang w:eastAsia="es-MX"/>
             </w:rPr>
           </w:pPr>
-          <w:hyperlink w:anchor="_Toc211880592" w:history="1">
+          <w:hyperlink w:anchor="_Toc212062722" w:history="1">
             <w:r>
               <w:rPr>
                 <w:rStyle w:val="Hipervnculo"/>
@@ -832,7 +832,7 @@
                 <w:noProof/>
                 <w:webHidden/>
               </w:rPr>
-              <w:instrText xml:space="preserve"> PAGEREF _Toc211880592 \h </w:instrText>
+              <w:instrText xml:space="preserve"> PAGEREF _Toc212062722 \h </w:instrText>
             </w:r>
             <w:r>
               <w:rPr>
@@ -852,7 +852,7 @@
                 <w:noProof/>
                 <w:webHidden/>
               </w:rPr>
-              <w:t>3</w:t>
+              <w:t>4</w:t>
             </w:r>
             <w:r>
               <w:rPr>
@@ -874,7 +874,7 @@
               <w:lang w:eastAsia="es-MX"/>
             </w:rPr>
           </w:pPr>
-          <w:hyperlink w:anchor="_Toc211880593" w:history="1">
+          <w:hyperlink w:anchor="_Toc212062723" w:history="1">
             <w:r>
               <w:rPr>
                 <w:rStyle w:val="Hipervnculo"/>
@@ -901,76 +901,7 @@
                 <w:noProof/>
                 <w:webHidden/>
               </w:rPr>
-              <w:instrText xml:space="preserve"> PAGEREF _Toc211880593 \h </w:instrText>
-            </w:r>
-            <w:r>
-              <w:rPr>
-                <w:noProof/>
-                <w:webHidden/>
-              </w:rPr>
-            </w:r>
-            <w:r>
-              <w:rPr>
-                <w:noProof/>
-                <w:webHidden/>
-              </w:rPr>
-              <w:fldChar w:fldCharType="separate"/>
-            </w:r>
-            <w:r>
-              <w:rPr>
-                <w:noProof/>
-                <w:webHidden/>
-              </w:rPr>
-              <w:t>5</w:t>
-            </w:r>
-            <w:r>
-              <w:rPr>
-                <w:noProof/>
-                <w:webHidden/>
-              </w:rPr>
-              <w:fldChar w:fldCharType="end"/>
-            </w:r>
-          </w:hyperlink>
-        </w:p>
-        <w:p>
-          <w:pPr>
-            <w:pStyle w:val="TDC2"/>
-            <w:rPr>
-              <w:rFonts w:eastAsiaTheme="minorEastAsia"/>
-              <w:noProof/>
-              <w:sz w:val="24"/>
-              <w:szCs w:val="24"/>
-              <w:lang w:eastAsia="es-MX"/>
-            </w:rPr>
-          </w:pPr>
-          <w:hyperlink w:anchor="_Toc211880594" w:history="1">
-            <w:r>
-              <w:rPr>
-                <w:rStyle w:val="Hipervnculo"/>
-                <w:noProof/>
-              </w:rPr>
-              <w:t>1.4 Objetivos de la organización</w:t>
-            </w:r>
-            <w:r>
-              <w:rPr>
-                <w:noProof/>
-                <w:webHidden/>
-              </w:rPr>
-              <w:tab/>
-            </w:r>
-            <w:r>
-              <w:rPr>
-                <w:noProof/>
-                <w:webHidden/>
-              </w:rPr>
-              <w:fldChar w:fldCharType="begin"/>
-            </w:r>
-            <w:r>
-              <w:rPr>
-                <w:noProof/>
-                <w:webHidden/>
-              </w:rPr>
-              <w:instrText xml:space="preserve"> PAGEREF _Toc211880594 \h </w:instrText>
+              <w:instrText xml:space="preserve"> PAGEREF _Toc212062723 \h </w:instrText>
             </w:r>
             <w:r>
               <w:rPr>
@@ -1003,6 +934,75 @@
         </w:p>
         <w:p>
           <w:pPr>
+            <w:pStyle w:val="TDC2"/>
+            <w:rPr>
+              <w:rFonts w:eastAsiaTheme="minorEastAsia"/>
+              <w:noProof/>
+              <w:sz w:val="24"/>
+              <w:szCs w:val="24"/>
+              <w:lang w:eastAsia="es-MX"/>
+            </w:rPr>
+          </w:pPr>
+          <w:hyperlink w:anchor="_Toc212062724" w:history="1">
+            <w:r>
+              <w:rPr>
+                <w:rStyle w:val="Hipervnculo"/>
+                <w:noProof/>
+              </w:rPr>
+              <w:t>1.4 Objetivos de la organización</w:t>
+            </w:r>
+            <w:r>
+              <w:rPr>
+                <w:noProof/>
+                <w:webHidden/>
+              </w:rPr>
+              <w:tab/>
+            </w:r>
+            <w:r>
+              <w:rPr>
+                <w:noProof/>
+                <w:webHidden/>
+              </w:rPr>
+              <w:fldChar w:fldCharType="begin"/>
+            </w:r>
+            <w:r>
+              <w:rPr>
+                <w:noProof/>
+                <w:webHidden/>
+              </w:rPr>
+              <w:instrText xml:space="preserve"> PAGEREF _Toc212062724 \h </w:instrText>
+            </w:r>
+            <w:r>
+              <w:rPr>
+                <w:noProof/>
+                <w:webHidden/>
+              </w:rPr>
+            </w:r>
+            <w:r>
+              <w:rPr>
+                <w:noProof/>
+                <w:webHidden/>
+              </w:rPr>
+              <w:fldChar w:fldCharType="separate"/>
+            </w:r>
+            <w:r>
+              <w:rPr>
+                <w:noProof/>
+                <w:webHidden/>
+              </w:rPr>
+              <w:t>7</w:t>
+            </w:r>
+            <w:r>
+              <w:rPr>
+                <w:noProof/>
+                <w:webHidden/>
+              </w:rPr>
+              <w:fldChar w:fldCharType="end"/>
+            </w:r>
+          </w:hyperlink>
+        </w:p>
+        <w:p>
+          <w:pPr>
             <w:pStyle w:val="TDC1"/>
             <w:tabs>
               <w:tab w:val="left" w:pos="1200"/>
@@ -1016,7 +1016,7 @@
               <w:lang w:eastAsia="es-MX"/>
             </w:rPr>
           </w:pPr>
-          <w:hyperlink w:anchor="_Toc211880595" w:history="1">
+          <w:hyperlink w:anchor="_Toc212062725" w:history="1">
             <w:r>
               <w:rPr>
                 <w:rStyle w:val="Hipervnculo"/>
@@ -1060,214 +1060,7 @@
                 <w:noProof/>
                 <w:webHidden/>
               </w:rPr>
-              <w:instrText xml:space="preserve"> PAGEREF _Toc211880595 \h </w:instrText>
-            </w:r>
-            <w:r>
-              <w:rPr>
-                <w:noProof/>
-                <w:webHidden/>
-              </w:rPr>
-            </w:r>
-            <w:r>
-              <w:rPr>
-                <w:noProof/>
-                <w:webHidden/>
-              </w:rPr>
-              <w:fldChar w:fldCharType="separate"/>
-            </w:r>
-            <w:r>
-              <w:rPr>
-                <w:noProof/>
-                <w:webHidden/>
-              </w:rPr>
-              <w:t>8</w:t>
-            </w:r>
-            <w:r>
-              <w:rPr>
-                <w:noProof/>
-                <w:webHidden/>
-              </w:rPr>
-              <w:fldChar w:fldCharType="end"/>
-            </w:r>
-          </w:hyperlink>
-        </w:p>
-        <w:p>
-          <w:pPr>
-            <w:pStyle w:val="TDC2"/>
-            <w:rPr>
-              <w:rFonts w:eastAsiaTheme="minorEastAsia"/>
-              <w:noProof/>
-              <w:sz w:val="24"/>
-              <w:szCs w:val="24"/>
-              <w:lang w:eastAsia="es-MX"/>
-            </w:rPr>
-          </w:pPr>
-          <w:hyperlink w:anchor="_Toc211880596" w:history="1">
-            <w:r>
-              <w:rPr>
-                <w:rStyle w:val="Hipervnculo"/>
-                <w:noProof/>
-              </w:rPr>
-              <w:t>2.1 Concepto</w:t>
-            </w:r>
-            <w:r>
-              <w:rPr>
-                <w:noProof/>
-                <w:webHidden/>
-              </w:rPr>
-              <w:tab/>
-            </w:r>
-            <w:r>
-              <w:rPr>
-                <w:noProof/>
-                <w:webHidden/>
-              </w:rPr>
-              <w:fldChar w:fldCharType="begin"/>
-            </w:r>
-            <w:r>
-              <w:rPr>
-                <w:noProof/>
-                <w:webHidden/>
-              </w:rPr>
-              <w:instrText xml:space="preserve"> PAGEREF _Toc211880596 \h </w:instrText>
-            </w:r>
-            <w:r>
-              <w:rPr>
-                <w:noProof/>
-                <w:webHidden/>
-              </w:rPr>
-            </w:r>
-            <w:r>
-              <w:rPr>
-                <w:noProof/>
-                <w:webHidden/>
-              </w:rPr>
-              <w:fldChar w:fldCharType="separate"/>
-            </w:r>
-            <w:r>
-              <w:rPr>
-                <w:noProof/>
-                <w:webHidden/>
-              </w:rPr>
-              <w:t>8</w:t>
-            </w:r>
-            <w:r>
-              <w:rPr>
-                <w:noProof/>
-                <w:webHidden/>
-              </w:rPr>
-              <w:fldChar w:fldCharType="end"/>
-            </w:r>
-          </w:hyperlink>
-        </w:p>
-        <w:p>
-          <w:pPr>
-            <w:pStyle w:val="TDC2"/>
-            <w:rPr>
-              <w:rFonts w:eastAsiaTheme="minorEastAsia"/>
-              <w:noProof/>
-              <w:sz w:val="24"/>
-              <w:szCs w:val="24"/>
-              <w:lang w:eastAsia="es-MX"/>
-            </w:rPr>
-          </w:pPr>
-          <w:hyperlink w:anchor="_Toc211880597" w:history="1">
-            <w:r>
-              <w:rPr>
-                <w:rStyle w:val="Hipervnculo"/>
-                <w:noProof/>
-              </w:rPr>
-              <w:t>2.2 Elementos</w:t>
-            </w:r>
-            <w:r>
-              <w:rPr>
-                <w:noProof/>
-                <w:webHidden/>
-              </w:rPr>
-              <w:tab/>
-            </w:r>
-            <w:r>
-              <w:rPr>
-                <w:noProof/>
-                <w:webHidden/>
-              </w:rPr>
-              <w:fldChar w:fldCharType="begin"/>
-            </w:r>
-            <w:r>
-              <w:rPr>
-                <w:noProof/>
-                <w:webHidden/>
-              </w:rPr>
-              <w:instrText xml:space="preserve"> PAGEREF _Toc211880597 \h </w:instrText>
-            </w:r>
-            <w:r>
-              <w:rPr>
-                <w:noProof/>
-                <w:webHidden/>
-              </w:rPr>
-            </w:r>
-            <w:r>
-              <w:rPr>
-                <w:noProof/>
-                <w:webHidden/>
-              </w:rPr>
-              <w:fldChar w:fldCharType="separate"/>
-            </w:r>
-            <w:r>
-              <w:rPr>
-                <w:noProof/>
-                <w:webHidden/>
-              </w:rPr>
-              <w:t>8</w:t>
-            </w:r>
-            <w:r>
-              <w:rPr>
-                <w:noProof/>
-                <w:webHidden/>
-              </w:rPr>
-              <w:fldChar w:fldCharType="end"/>
-            </w:r>
-          </w:hyperlink>
-        </w:p>
-        <w:p>
-          <w:pPr>
-            <w:pStyle w:val="TDC2"/>
-            <w:rPr>
-              <w:rFonts w:eastAsiaTheme="minorEastAsia"/>
-              <w:noProof/>
-              <w:sz w:val="24"/>
-              <w:szCs w:val="24"/>
-              <w:lang w:eastAsia="es-MX"/>
-            </w:rPr>
-          </w:pPr>
-          <w:hyperlink w:anchor="_Toc211880598" w:history="1">
-            <w:r>
-              <w:rPr>
-                <w:rStyle w:val="Hipervnculo"/>
-                <w:noProof/>
-              </w:rPr>
-              <w:t>2.3 Características</w:t>
-            </w:r>
-            <w:r>
-              <w:rPr>
-                <w:noProof/>
-                <w:webHidden/>
-              </w:rPr>
-              <w:tab/>
-            </w:r>
-            <w:r>
-              <w:rPr>
-                <w:noProof/>
-                <w:webHidden/>
-              </w:rPr>
-              <w:fldChar w:fldCharType="begin"/>
-            </w:r>
-            <w:r>
-              <w:rPr>
-                <w:noProof/>
-                <w:webHidden/>
-              </w:rPr>
-              <w:instrText xml:space="preserve"> PAGEREF _Toc211880598 \h </w:instrText>
+              <w:instrText xml:space="preserve"> PAGEREF _Toc212062725 \h </w:instrText>
             </w:r>
             <w:r>
               <w:rPr>
@@ -1300,6 +1093,213 @@
         </w:p>
         <w:p>
           <w:pPr>
+            <w:pStyle w:val="TDC2"/>
+            <w:rPr>
+              <w:rFonts w:eastAsiaTheme="minorEastAsia"/>
+              <w:noProof/>
+              <w:sz w:val="24"/>
+              <w:szCs w:val="24"/>
+              <w:lang w:eastAsia="es-MX"/>
+            </w:rPr>
+          </w:pPr>
+          <w:hyperlink w:anchor="_Toc212062726" w:history="1">
+            <w:r>
+              <w:rPr>
+                <w:rStyle w:val="Hipervnculo"/>
+                <w:noProof/>
+              </w:rPr>
+              <w:t>2.1 Concepto</w:t>
+            </w:r>
+            <w:r>
+              <w:rPr>
+                <w:noProof/>
+                <w:webHidden/>
+              </w:rPr>
+              <w:tab/>
+            </w:r>
+            <w:r>
+              <w:rPr>
+                <w:noProof/>
+                <w:webHidden/>
+              </w:rPr>
+              <w:fldChar w:fldCharType="begin"/>
+            </w:r>
+            <w:r>
+              <w:rPr>
+                <w:noProof/>
+                <w:webHidden/>
+              </w:rPr>
+              <w:instrText xml:space="preserve"> PAGEREF _Toc212062726 \h </w:instrText>
+            </w:r>
+            <w:r>
+              <w:rPr>
+                <w:noProof/>
+                <w:webHidden/>
+              </w:rPr>
+            </w:r>
+            <w:r>
+              <w:rPr>
+                <w:noProof/>
+                <w:webHidden/>
+              </w:rPr>
+              <w:fldChar w:fldCharType="separate"/>
+            </w:r>
+            <w:r>
+              <w:rPr>
+                <w:noProof/>
+                <w:webHidden/>
+              </w:rPr>
+              <w:t>9</w:t>
+            </w:r>
+            <w:r>
+              <w:rPr>
+                <w:noProof/>
+                <w:webHidden/>
+              </w:rPr>
+              <w:fldChar w:fldCharType="end"/>
+            </w:r>
+          </w:hyperlink>
+        </w:p>
+        <w:p>
+          <w:pPr>
+            <w:pStyle w:val="TDC2"/>
+            <w:rPr>
+              <w:rFonts w:eastAsiaTheme="minorEastAsia"/>
+              <w:noProof/>
+              <w:sz w:val="24"/>
+              <w:szCs w:val="24"/>
+              <w:lang w:eastAsia="es-MX"/>
+            </w:rPr>
+          </w:pPr>
+          <w:hyperlink w:anchor="_Toc212062727" w:history="1">
+            <w:r>
+              <w:rPr>
+                <w:rStyle w:val="Hipervnculo"/>
+                <w:noProof/>
+              </w:rPr>
+              <w:t>2.2 Elementos</w:t>
+            </w:r>
+            <w:r>
+              <w:rPr>
+                <w:noProof/>
+                <w:webHidden/>
+              </w:rPr>
+              <w:tab/>
+            </w:r>
+            <w:r>
+              <w:rPr>
+                <w:noProof/>
+                <w:webHidden/>
+              </w:rPr>
+              <w:fldChar w:fldCharType="begin"/>
+            </w:r>
+            <w:r>
+              <w:rPr>
+                <w:noProof/>
+                <w:webHidden/>
+              </w:rPr>
+              <w:instrText xml:space="preserve"> PAGEREF _Toc212062727 \h </w:instrText>
+            </w:r>
+            <w:r>
+              <w:rPr>
+                <w:noProof/>
+                <w:webHidden/>
+              </w:rPr>
+            </w:r>
+            <w:r>
+              <w:rPr>
+                <w:noProof/>
+                <w:webHidden/>
+              </w:rPr>
+              <w:fldChar w:fldCharType="separate"/>
+            </w:r>
+            <w:r>
+              <w:rPr>
+                <w:noProof/>
+                <w:webHidden/>
+              </w:rPr>
+              <w:t>9</w:t>
+            </w:r>
+            <w:r>
+              <w:rPr>
+                <w:noProof/>
+                <w:webHidden/>
+              </w:rPr>
+              <w:fldChar w:fldCharType="end"/>
+            </w:r>
+          </w:hyperlink>
+        </w:p>
+        <w:p>
+          <w:pPr>
+            <w:pStyle w:val="TDC2"/>
+            <w:rPr>
+              <w:rFonts w:eastAsiaTheme="minorEastAsia"/>
+              <w:noProof/>
+              <w:sz w:val="24"/>
+              <w:szCs w:val="24"/>
+              <w:lang w:eastAsia="es-MX"/>
+            </w:rPr>
+          </w:pPr>
+          <w:hyperlink w:anchor="_Toc212062728" w:history="1">
+            <w:r>
+              <w:rPr>
+                <w:rStyle w:val="Hipervnculo"/>
+                <w:noProof/>
+              </w:rPr>
+              <w:t>2.3 Características</w:t>
+            </w:r>
+            <w:r>
+              <w:rPr>
+                <w:noProof/>
+                <w:webHidden/>
+              </w:rPr>
+              <w:tab/>
+            </w:r>
+            <w:r>
+              <w:rPr>
+                <w:noProof/>
+                <w:webHidden/>
+              </w:rPr>
+              <w:fldChar w:fldCharType="begin"/>
+            </w:r>
+            <w:r>
+              <w:rPr>
+                <w:noProof/>
+                <w:webHidden/>
+              </w:rPr>
+              <w:instrText xml:space="preserve"> PAGEREF _Toc212062728 \h </w:instrText>
+            </w:r>
+            <w:r>
+              <w:rPr>
+                <w:noProof/>
+                <w:webHidden/>
+              </w:rPr>
+            </w:r>
+            <w:r>
+              <w:rPr>
+                <w:noProof/>
+                <w:webHidden/>
+              </w:rPr>
+              <w:fldChar w:fldCharType="separate"/>
+            </w:r>
+            <w:r>
+              <w:rPr>
+                <w:noProof/>
+                <w:webHidden/>
+              </w:rPr>
+              <w:t>10</w:t>
+            </w:r>
+            <w:r>
+              <w:rPr>
+                <w:noProof/>
+                <w:webHidden/>
+              </w:rPr>
+              <w:fldChar w:fldCharType="end"/>
+            </w:r>
+          </w:hyperlink>
+        </w:p>
+        <w:p>
+          <w:pPr>
             <w:pStyle w:val="TDC1"/>
             <w:tabs>
               <w:tab w:val="left" w:pos="1200"/>
@@ -1313,7 +1313,7 @@
               <w:lang w:eastAsia="es-MX"/>
             </w:rPr>
           </w:pPr>
-          <w:hyperlink w:anchor="_Toc211880599" w:history="1">
+          <w:hyperlink w:anchor="_Toc212062729" w:history="1">
             <w:r>
               <w:rPr>
                 <w:rStyle w:val="Hipervnculo"/>
@@ -1357,145 +1357,7 @@
                 <w:noProof/>
                 <w:webHidden/>
               </w:rPr>
-              <w:instrText xml:space="preserve"> PAGEREF _Toc211880599 \h </w:instrText>
-            </w:r>
-            <w:r>
-              <w:rPr>
-                <w:noProof/>
-                <w:webHidden/>
-              </w:rPr>
-            </w:r>
-            <w:r>
-              <w:rPr>
-                <w:noProof/>
-                <w:webHidden/>
-              </w:rPr>
-              <w:fldChar w:fldCharType="separate"/>
-            </w:r>
-            <w:r>
-              <w:rPr>
-                <w:noProof/>
-                <w:webHidden/>
-              </w:rPr>
-              <w:t>12</w:t>
-            </w:r>
-            <w:r>
-              <w:rPr>
-                <w:noProof/>
-                <w:webHidden/>
-              </w:rPr>
-              <w:fldChar w:fldCharType="end"/>
-            </w:r>
-          </w:hyperlink>
-        </w:p>
-        <w:p>
-          <w:pPr>
-            <w:pStyle w:val="TDC2"/>
-            <w:rPr>
-              <w:rFonts w:eastAsiaTheme="minorEastAsia"/>
-              <w:noProof/>
-              <w:sz w:val="24"/>
-              <w:szCs w:val="24"/>
-              <w:lang w:eastAsia="es-MX"/>
-            </w:rPr>
-          </w:pPr>
-          <w:hyperlink w:anchor="_Toc211880600" w:history="1">
-            <w:r>
-              <w:rPr>
-                <w:rStyle w:val="Hipervnculo"/>
-                <w:noProof/>
-              </w:rPr>
-              <w:t>3.1 Concepto</w:t>
-            </w:r>
-            <w:r>
-              <w:rPr>
-                <w:noProof/>
-                <w:webHidden/>
-              </w:rPr>
-              <w:tab/>
-            </w:r>
-            <w:r>
-              <w:rPr>
-                <w:noProof/>
-                <w:webHidden/>
-              </w:rPr>
-              <w:fldChar w:fldCharType="begin"/>
-            </w:r>
-            <w:r>
-              <w:rPr>
-                <w:noProof/>
-                <w:webHidden/>
-              </w:rPr>
-              <w:instrText xml:space="preserve"> PAGEREF _Toc211880600 \h </w:instrText>
-            </w:r>
-            <w:r>
-              <w:rPr>
-                <w:noProof/>
-                <w:webHidden/>
-              </w:rPr>
-            </w:r>
-            <w:r>
-              <w:rPr>
-                <w:noProof/>
-                <w:webHidden/>
-              </w:rPr>
-              <w:fldChar w:fldCharType="separate"/>
-            </w:r>
-            <w:r>
-              <w:rPr>
-                <w:noProof/>
-                <w:webHidden/>
-              </w:rPr>
-              <w:t>12</w:t>
-            </w:r>
-            <w:r>
-              <w:rPr>
-                <w:noProof/>
-                <w:webHidden/>
-              </w:rPr>
-              <w:fldChar w:fldCharType="end"/>
-            </w:r>
-          </w:hyperlink>
-        </w:p>
-        <w:p>
-          <w:pPr>
-            <w:pStyle w:val="TDC2"/>
-            <w:rPr>
-              <w:rFonts w:eastAsiaTheme="minorEastAsia"/>
-              <w:noProof/>
-              <w:sz w:val="24"/>
-              <w:szCs w:val="24"/>
-              <w:lang w:eastAsia="es-MX"/>
-            </w:rPr>
-          </w:pPr>
-          <w:hyperlink w:anchor="_Toc211880601" w:history="1">
-            <w:r>
-              <w:rPr>
-                <w:rStyle w:val="Hipervnculo"/>
-                <w:noProof/>
-              </w:rPr>
-              <w:t>3.2 Elementos</w:t>
-            </w:r>
-            <w:r>
-              <w:rPr>
-                <w:noProof/>
-                <w:webHidden/>
-              </w:rPr>
-              <w:tab/>
-            </w:r>
-            <w:r>
-              <w:rPr>
-                <w:noProof/>
-                <w:webHidden/>
-              </w:rPr>
-              <w:fldChar w:fldCharType="begin"/>
-            </w:r>
-            <w:r>
-              <w:rPr>
-                <w:noProof/>
-                <w:webHidden/>
-              </w:rPr>
-              <w:instrText xml:space="preserve"> PAGEREF _Toc211880601 \h </w:instrText>
+              <w:instrText xml:space="preserve"> PAGEREF _Toc212062729 \h </w:instrText>
             </w:r>
             <w:r>
               <w:rPr>
@@ -1537,13 +1399,13 @@
               <w:lang w:eastAsia="es-MX"/>
             </w:rPr>
           </w:pPr>
-          <w:hyperlink w:anchor="_Toc211880602" w:history="1">
+          <w:hyperlink w:anchor="_Toc212062730" w:history="1">
             <w:r>
               <w:rPr>
                 <w:rStyle w:val="Hipervnculo"/>
                 <w:noProof/>
               </w:rPr>
-              <w:t>3.3 Características</w:t>
+              <w:t>3.1 Concepto</w:t>
             </w:r>
             <w:r>
               <w:rPr>
@@ -1564,7 +1426,7 @@
                 <w:noProof/>
                 <w:webHidden/>
               </w:rPr>
-              <w:instrText xml:space="preserve"> PAGEREF _Toc211880602 \h </w:instrText>
+              <w:instrText xml:space="preserve"> PAGEREF _Toc212062730 \h </w:instrText>
             </w:r>
             <w:r>
               <w:rPr>
@@ -1606,7 +1468,145 @@
               <w:lang w:eastAsia="es-MX"/>
             </w:rPr>
           </w:pPr>
-          <w:hyperlink w:anchor="_Toc211880603" w:history="1">
+          <w:hyperlink w:anchor="_Toc212062731" w:history="1">
+            <w:r>
+              <w:rPr>
+                <w:rStyle w:val="Hipervnculo"/>
+                <w:noProof/>
+              </w:rPr>
+              <w:t>3.2 Elementos</w:t>
+            </w:r>
+            <w:r>
+              <w:rPr>
+                <w:noProof/>
+                <w:webHidden/>
+              </w:rPr>
+              <w:tab/>
+            </w:r>
+            <w:r>
+              <w:rPr>
+                <w:noProof/>
+                <w:webHidden/>
+              </w:rPr>
+              <w:fldChar w:fldCharType="begin"/>
+            </w:r>
+            <w:r>
+              <w:rPr>
+                <w:noProof/>
+                <w:webHidden/>
+              </w:rPr>
+              <w:instrText xml:space="preserve"> PAGEREF _Toc212062731 \h </w:instrText>
+            </w:r>
+            <w:r>
+              <w:rPr>
+                <w:noProof/>
+                <w:webHidden/>
+              </w:rPr>
+            </w:r>
+            <w:r>
+              <w:rPr>
+                <w:noProof/>
+                <w:webHidden/>
+              </w:rPr>
+              <w:fldChar w:fldCharType="separate"/>
+            </w:r>
+            <w:r>
+              <w:rPr>
+                <w:noProof/>
+                <w:webHidden/>
+              </w:rPr>
+              <w:t>14</w:t>
+            </w:r>
+            <w:r>
+              <w:rPr>
+                <w:noProof/>
+                <w:webHidden/>
+              </w:rPr>
+              <w:fldChar w:fldCharType="end"/>
+            </w:r>
+          </w:hyperlink>
+        </w:p>
+        <w:p>
+          <w:pPr>
+            <w:pStyle w:val="TDC2"/>
+            <w:rPr>
+              <w:rFonts w:eastAsiaTheme="minorEastAsia"/>
+              <w:noProof/>
+              <w:sz w:val="24"/>
+              <w:szCs w:val="24"/>
+              <w:lang w:eastAsia="es-MX"/>
+            </w:rPr>
+          </w:pPr>
+          <w:hyperlink w:anchor="_Toc212062732" w:history="1">
+            <w:r>
+              <w:rPr>
+                <w:rStyle w:val="Hipervnculo"/>
+                <w:noProof/>
+              </w:rPr>
+              <w:t>3.3 Características</w:t>
+            </w:r>
+            <w:r>
+              <w:rPr>
+                <w:noProof/>
+                <w:webHidden/>
+              </w:rPr>
+              <w:tab/>
+            </w:r>
+            <w:r>
+              <w:rPr>
+                <w:noProof/>
+                <w:webHidden/>
+              </w:rPr>
+              <w:fldChar w:fldCharType="begin"/>
+            </w:r>
+            <w:r>
+              <w:rPr>
+                <w:noProof/>
+                <w:webHidden/>
+              </w:rPr>
+              <w:instrText xml:space="preserve"> PAGEREF _Toc212062732 \h </w:instrText>
+            </w:r>
+            <w:r>
+              <w:rPr>
+                <w:noProof/>
+                <w:webHidden/>
+              </w:rPr>
+            </w:r>
+            <w:r>
+              <w:rPr>
+                <w:noProof/>
+                <w:webHidden/>
+              </w:rPr>
+              <w:fldChar w:fldCharType="separate"/>
+            </w:r>
+            <w:r>
+              <w:rPr>
+                <w:noProof/>
+                <w:webHidden/>
+              </w:rPr>
+              <w:t>14</w:t>
+            </w:r>
+            <w:r>
+              <w:rPr>
+                <w:noProof/>
+                <w:webHidden/>
+              </w:rPr>
+              <w:fldChar w:fldCharType="end"/>
+            </w:r>
+          </w:hyperlink>
+        </w:p>
+        <w:p>
+          <w:pPr>
+            <w:pStyle w:val="TDC2"/>
+            <w:rPr>
+              <w:rFonts w:eastAsiaTheme="minorEastAsia"/>
+              <w:noProof/>
+              <w:sz w:val="24"/>
+              <w:szCs w:val="24"/>
+              <w:lang w:eastAsia="es-MX"/>
+            </w:rPr>
+          </w:pPr>
+          <w:hyperlink w:anchor="_Toc212062733" w:history="1">
             <w:r>
               <w:rPr>
                 <w:rStyle w:val="Hipervnculo"/>
@@ -1633,7 +1633,7 @@
                 <w:noProof/>
                 <w:webHidden/>
               </w:rPr>
-              <w:instrText xml:space="preserve"> PAGEREF _Toc211880603 \h </w:instrText>
+              <w:instrText xml:space="preserve"> PAGEREF _Toc212062733 \h </w:instrText>
             </w:r>
             <w:r>
               <w:rPr>
@@ -1653,7 +1653,7 @@
                 <w:noProof/>
                 <w:webHidden/>
               </w:rPr>
-              <w:t>15</w:t>
+              <w:t>16</w:t>
             </w:r>
             <w:r>
               <w:rPr>
@@ -1679,7 +1679,7 @@
               <w:lang w:eastAsia="es-MX"/>
             </w:rPr>
           </w:pPr>
-          <w:hyperlink w:anchor="_Toc211880604" w:history="1">
+          <w:hyperlink w:anchor="_Toc212062734" w:history="1">
             <w:r>
               <w:rPr>
                 <w:rStyle w:val="Hipervnculo"/>
@@ -1723,214 +1723,7 @@
                 <w:noProof/>
                 <w:webHidden/>
               </w:rPr>
-              <w:instrText xml:space="preserve"> PAGEREF _Toc211880604 \h </w:instrText>
-            </w:r>
-            <w:r>
-              <w:rPr>
-                <w:noProof/>
-                <w:webHidden/>
-              </w:rPr>
-            </w:r>
-            <w:r>
-              <w:rPr>
-                <w:noProof/>
-                <w:webHidden/>
-              </w:rPr>
-              <w:fldChar w:fldCharType="separate"/>
-            </w:r>
-            <w:r>
-              <w:rPr>
-                <w:noProof/>
-                <w:webHidden/>
-              </w:rPr>
-              <w:t>17</w:t>
-            </w:r>
-            <w:r>
-              <w:rPr>
-                <w:noProof/>
-                <w:webHidden/>
-              </w:rPr>
-              <w:fldChar w:fldCharType="end"/>
-            </w:r>
-          </w:hyperlink>
-        </w:p>
-        <w:p>
-          <w:pPr>
-            <w:pStyle w:val="TDC2"/>
-            <w:rPr>
-              <w:rFonts w:eastAsiaTheme="minorEastAsia"/>
-              <w:noProof/>
-              <w:sz w:val="24"/>
-              <w:szCs w:val="24"/>
-              <w:lang w:eastAsia="es-MX"/>
-            </w:rPr>
-          </w:pPr>
-          <w:hyperlink w:anchor="_Toc211880605" w:history="1">
-            <w:r>
-              <w:rPr>
-                <w:rStyle w:val="Hipervnculo"/>
-                <w:noProof/>
-              </w:rPr>
-              <w:t>4.1 Concepto</w:t>
-            </w:r>
-            <w:r>
-              <w:rPr>
-                <w:noProof/>
-                <w:webHidden/>
-              </w:rPr>
-              <w:tab/>
-            </w:r>
-            <w:r>
-              <w:rPr>
-                <w:noProof/>
-                <w:webHidden/>
-              </w:rPr>
-              <w:fldChar w:fldCharType="begin"/>
-            </w:r>
-            <w:r>
-              <w:rPr>
-                <w:noProof/>
-                <w:webHidden/>
-              </w:rPr>
-              <w:instrText xml:space="preserve"> PAGEREF _Toc211880605 \h </w:instrText>
-            </w:r>
-            <w:r>
-              <w:rPr>
-                <w:noProof/>
-                <w:webHidden/>
-              </w:rPr>
-            </w:r>
-            <w:r>
-              <w:rPr>
-                <w:noProof/>
-                <w:webHidden/>
-              </w:rPr>
-              <w:fldChar w:fldCharType="separate"/>
-            </w:r>
-            <w:r>
-              <w:rPr>
-                <w:noProof/>
-                <w:webHidden/>
-              </w:rPr>
-              <w:t>17</w:t>
-            </w:r>
-            <w:r>
-              <w:rPr>
-                <w:noProof/>
-                <w:webHidden/>
-              </w:rPr>
-              <w:fldChar w:fldCharType="end"/>
-            </w:r>
-          </w:hyperlink>
-        </w:p>
-        <w:p>
-          <w:pPr>
-            <w:pStyle w:val="TDC2"/>
-            <w:rPr>
-              <w:rFonts w:eastAsiaTheme="minorEastAsia"/>
-              <w:noProof/>
-              <w:sz w:val="24"/>
-              <w:szCs w:val="24"/>
-              <w:lang w:eastAsia="es-MX"/>
-            </w:rPr>
-          </w:pPr>
-          <w:hyperlink w:anchor="_Toc211880606" w:history="1">
-            <w:r>
-              <w:rPr>
-                <w:rStyle w:val="Hipervnculo"/>
-                <w:noProof/>
-              </w:rPr>
-              <w:t>4.2 Tipos</w:t>
-            </w:r>
-            <w:r>
-              <w:rPr>
-                <w:noProof/>
-                <w:webHidden/>
-              </w:rPr>
-              <w:tab/>
-            </w:r>
-            <w:r>
-              <w:rPr>
-                <w:noProof/>
-                <w:webHidden/>
-              </w:rPr>
-              <w:fldChar w:fldCharType="begin"/>
-            </w:r>
-            <w:r>
-              <w:rPr>
-                <w:noProof/>
-                <w:webHidden/>
-              </w:rPr>
-              <w:instrText xml:space="preserve"> PAGEREF _Toc211880606 \h </w:instrText>
-            </w:r>
-            <w:r>
-              <w:rPr>
-                <w:noProof/>
-                <w:webHidden/>
-              </w:rPr>
-            </w:r>
-            <w:r>
-              <w:rPr>
-                <w:noProof/>
-                <w:webHidden/>
-              </w:rPr>
-              <w:fldChar w:fldCharType="separate"/>
-            </w:r>
-            <w:r>
-              <w:rPr>
-                <w:noProof/>
-                <w:webHidden/>
-              </w:rPr>
-              <w:t>17</w:t>
-            </w:r>
-            <w:r>
-              <w:rPr>
-                <w:noProof/>
-                <w:webHidden/>
-              </w:rPr>
-              <w:fldChar w:fldCharType="end"/>
-            </w:r>
-          </w:hyperlink>
-        </w:p>
-        <w:p>
-          <w:pPr>
-            <w:pStyle w:val="TDC2"/>
-            <w:rPr>
-              <w:rFonts w:eastAsiaTheme="minorEastAsia"/>
-              <w:noProof/>
-              <w:sz w:val="24"/>
-              <w:szCs w:val="24"/>
-              <w:lang w:eastAsia="es-MX"/>
-            </w:rPr>
-          </w:pPr>
-          <w:hyperlink w:anchor="_Toc211880607" w:history="1">
-            <w:r>
-              <w:rPr>
-                <w:rStyle w:val="Hipervnculo"/>
-                <w:noProof/>
-              </w:rPr>
-              <w:t>4.3 Características</w:t>
-            </w:r>
-            <w:r>
-              <w:rPr>
-                <w:noProof/>
-                <w:webHidden/>
-              </w:rPr>
-              <w:tab/>
-            </w:r>
-            <w:r>
-              <w:rPr>
-                <w:noProof/>
-                <w:webHidden/>
-              </w:rPr>
-              <w:fldChar w:fldCharType="begin"/>
-            </w:r>
-            <w:r>
-              <w:rPr>
-                <w:noProof/>
-                <w:webHidden/>
-              </w:rPr>
-              <w:instrText xml:space="preserve"> PAGEREF _Toc211880607 \h </w:instrText>
+              <w:instrText xml:space="preserve"> PAGEREF _Toc212062734 \h </w:instrText>
             </w:r>
             <w:r>
               <w:rPr>
@@ -1963,6 +1756,213 @@
         </w:p>
         <w:p>
           <w:pPr>
+            <w:pStyle w:val="TDC2"/>
+            <w:rPr>
+              <w:rFonts w:eastAsiaTheme="minorEastAsia"/>
+              <w:noProof/>
+              <w:sz w:val="24"/>
+              <w:szCs w:val="24"/>
+              <w:lang w:eastAsia="es-MX"/>
+            </w:rPr>
+          </w:pPr>
+          <w:hyperlink w:anchor="_Toc212062735" w:history="1">
+            <w:r>
+              <w:rPr>
+                <w:rStyle w:val="Hipervnculo"/>
+                <w:noProof/>
+              </w:rPr>
+              <w:t>4.1 Concepto</w:t>
+            </w:r>
+            <w:r>
+              <w:rPr>
+                <w:noProof/>
+                <w:webHidden/>
+              </w:rPr>
+              <w:tab/>
+            </w:r>
+            <w:r>
+              <w:rPr>
+                <w:noProof/>
+                <w:webHidden/>
+              </w:rPr>
+              <w:fldChar w:fldCharType="begin"/>
+            </w:r>
+            <w:r>
+              <w:rPr>
+                <w:noProof/>
+                <w:webHidden/>
+              </w:rPr>
+              <w:instrText xml:space="preserve"> PAGEREF _Toc212062735 \h </w:instrText>
+            </w:r>
+            <w:r>
+              <w:rPr>
+                <w:noProof/>
+                <w:webHidden/>
+              </w:rPr>
+            </w:r>
+            <w:r>
+              <w:rPr>
+                <w:noProof/>
+                <w:webHidden/>
+              </w:rPr>
+              <w:fldChar w:fldCharType="separate"/>
+            </w:r>
+            <w:r>
+              <w:rPr>
+                <w:noProof/>
+                <w:webHidden/>
+              </w:rPr>
+              <w:t>18</w:t>
+            </w:r>
+            <w:r>
+              <w:rPr>
+                <w:noProof/>
+                <w:webHidden/>
+              </w:rPr>
+              <w:fldChar w:fldCharType="end"/>
+            </w:r>
+          </w:hyperlink>
+        </w:p>
+        <w:p>
+          <w:pPr>
+            <w:pStyle w:val="TDC2"/>
+            <w:rPr>
+              <w:rFonts w:eastAsiaTheme="minorEastAsia"/>
+              <w:noProof/>
+              <w:sz w:val="24"/>
+              <w:szCs w:val="24"/>
+              <w:lang w:eastAsia="es-MX"/>
+            </w:rPr>
+          </w:pPr>
+          <w:hyperlink w:anchor="_Toc212062736" w:history="1">
+            <w:r>
+              <w:rPr>
+                <w:rStyle w:val="Hipervnculo"/>
+                <w:noProof/>
+              </w:rPr>
+              <w:t>4.2 Tipos</w:t>
+            </w:r>
+            <w:r>
+              <w:rPr>
+                <w:noProof/>
+                <w:webHidden/>
+              </w:rPr>
+              <w:tab/>
+            </w:r>
+            <w:r>
+              <w:rPr>
+                <w:noProof/>
+                <w:webHidden/>
+              </w:rPr>
+              <w:fldChar w:fldCharType="begin"/>
+            </w:r>
+            <w:r>
+              <w:rPr>
+                <w:noProof/>
+                <w:webHidden/>
+              </w:rPr>
+              <w:instrText xml:space="preserve"> PAGEREF _Toc212062736 \h </w:instrText>
+            </w:r>
+            <w:r>
+              <w:rPr>
+                <w:noProof/>
+                <w:webHidden/>
+              </w:rPr>
+            </w:r>
+            <w:r>
+              <w:rPr>
+                <w:noProof/>
+                <w:webHidden/>
+              </w:rPr>
+              <w:fldChar w:fldCharType="separate"/>
+            </w:r>
+            <w:r>
+              <w:rPr>
+                <w:noProof/>
+                <w:webHidden/>
+              </w:rPr>
+              <w:t>18</w:t>
+            </w:r>
+            <w:r>
+              <w:rPr>
+                <w:noProof/>
+                <w:webHidden/>
+              </w:rPr>
+              <w:fldChar w:fldCharType="end"/>
+            </w:r>
+          </w:hyperlink>
+        </w:p>
+        <w:p>
+          <w:pPr>
+            <w:pStyle w:val="TDC2"/>
+            <w:rPr>
+              <w:rFonts w:eastAsiaTheme="minorEastAsia"/>
+              <w:noProof/>
+              <w:sz w:val="24"/>
+              <w:szCs w:val="24"/>
+              <w:lang w:eastAsia="es-MX"/>
+            </w:rPr>
+          </w:pPr>
+          <w:hyperlink w:anchor="_Toc212062737" w:history="1">
+            <w:r>
+              <w:rPr>
+                <w:rStyle w:val="Hipervnculo"/>
+                <w:noProof/>
+              </w:rPr>
+              <w:t>4.3 Características</w:t>
+            </w:r>
+            <w:r>
+              <w:rPr>
+                <w:noProof/>
+                <w:webHidden/>
+              </w:rPr>
+              <w:tab/>
+            </w:r>
+            <w:r>
+              <w:rPr>
+                <w:noProof/>
+                <w:webHidden/>
+              </w:rPr>
+              <w:fldChar w:fldCharType="begin"/>
+            </w:r>
+            <w:r>
+              <w:rPr>
+                <w:noProof/>
+                <w:webHidden/>
+              </w:rPr>
+              <w:instrText xml:space="preserve"> PAGEREF _Toc212062737 \h </w:instrText>
+            </w:r>
+            <w:r>
+              <w:rPr>
+                <w:noProof/>
+                <w:webHidden/>
+              </w:rPr>
+            </w:r>
+            <w:r>
+              <w:rPr>
+                <w:noProof/>
+                <w:webHidden/>
+              </w:rPr>
+              <w:fldChar w:fldCharType="separate"/>
+            </w:r>
+            <w:r>
+              <w:rPr>
+                <w:noProof/>
+                <w:webHidden/>
+              </w:rPr>
+              <w:t>19</w:t>
+            </w:r>
+            <w:r>
+              <w:rPr>
+                <w:noProof/>
+                <w:webHidden/>
+              </w:rPr>
+              <w:fldChar w:fldCharType="end"/>
+            </w:r>
+          </w:hyperlink>
+        </w:p>
+        <w:p>
+          <w:pPr>
             <w:pStyle w:val="TDC1"/>
             <w:tabs>
               <w:tab w:val="right" w:leader="dot" w:pos="9962"/>
@@ -1975,7 +1975,7 @@
               <w:lang w:eastAsia="es-MX"/>
             </w:rPr>
           </w:pPr>
-          <w:hyperlink w:anchor="_Toc211880608" w:history="1">
+          <w:hyperlink w:anchor="_Toc212062738" w:history="1">
             <w:r>
               <w:rPr>
                 <w:rStyle w:val="Hipervnculo"/>
@@ -2002,79 +2002,7 @@
                 <w:noProof/>
                 <w:webHidden/>
               </w:rPr>
-              <w:instrText xml:space="preserve"> PAGEREF _Toc211880608 \h </w:instrText>
-            </w:r>
-            <w:r>
-              <w:rPr>
-                <w:noProof/>
-                <w:webHidden/>
-              </w:rPr>
-            </w:r>
-            <w:r>
-              <w:rPr>
-                <w:noProof/>
-                <w:webHidden/>
-              </w:rPr>
-              <w:fldChar w:fldCharType="separate"/>
-            </w:r>
-            <w:r>
-              <w:rPr>
-                <w:noProof/>
-                <w:webHidden/>
-              </w:rPr>
-              <w:t>20</w:t>
-            </w:r>
-            <w:r>
-              <w:rPr>
-                <w:noProof/>
-                <w:webHidden/>
-              </w:rPr>
-              <w:fldChar w:fldCharType="end"/>
-            </w:r>
-          </w:hyperlink>
-        </w:p>
-        <w:p>
-          <w:pPr>
-            <w:pStyle w:val="TDC1"/>
-            <w:tabs>
-              <w:tab w:val="right" w:leader="dot" w:pos="9962"/>
-            </w:tabs>
-            <w:rPr>
-              <w:rFonts w:eastAsiaTheme="minorEastAsia"/>
-              <w:noProof/>
-              <w:sz w:val="24"/>
-              <w:szCs w:val="24"/>
-              <w:lang w:eastAsia="es-MX"/>
-            </w:rPr>
-          </w:pPr>
-          <w:hyperlink w:anchor="_Toc211880609" w:history="1">
-            <w:r>
-              <w:rPr>
-                <w:rStyle w:val="Hipervnculo"/>
-                <w:noProof/>
-              </w:rPr>
-              <w:t>Glosario</w:t>
-            </w:r>
-            <w:r>
-              <w:rPr>
-                <w:noProof/>
-                <w:webHidden/>
-              </w:rPr>
-              <w:tab/>
-            </w:r>
-            <w:r>
-              <w:rPr>
-                <w:noProof/>
-                <w:webHidden/>
-              </w:rPr>
-              <w:fldChar w:fldCharType="begin"/>
-            </w:r>
-            <w:r>
-              <w:rPr>
-                <w:noProof/>
-                <w:webHidden/>
-              </w:rPr>
-              <w:instrText xml:space="preserve"> PAGEREF _Toc211880609 \h </w:instrText>
+              <w:instrText xml:space="preserve"> PAGEREF _Toc212062738 \h </w:instrText>
             </w:r>
             <w:r>
               <w:rPr>
@@ -2119,7 +2047,79 @@
               <w:lang w:eastAsia="es-MX"/>
             </w:rPr>
           </w:pPr>
-          <w:hyperlink w:anchor="_Toc211880610" w:history="1">
+          <w:hyperlink w:anchor="_Toc212062739" w:history="1">
+            <w:r>
+              <w:rPr>
+                <w:rStyle w:val="Hipervnculo"/>
+                <w:noProof/>
+              </w:rPr>
+              <w:t>Glosario</w:t>
+            </w:r>
+            <w:r>
+              <w:rPr>
+                <w:noProof/>
+                <w:webHidden/>
+              </w:rPr>
+              <w:tab/>
+            </w:r>
+            <w:r>
+              <w:rPr>
+                <w:noProof/>
+                <w:webHidden/>
+              </w:rPr>
+              <w:fldChar w:fldCharType="begin"/>
+            </w:r>
+            <w:r>
+              <w:rPr>
+                <w:noProof/>
+                <w:webHidden/>
+              </w:rPr>
+              <w:instrText xml:space="preserve"> PAGEREF _Toc212062739 \h </w:instrText>
+            </w:r>
+            <w:r>
+              <w:rPr>
+                <w:noProof/>
+                <w:webHidden/>
+              </w:rPr>
+            </w:r>
+            <w:r>
+              <w:rPr>
+                <w:noProof/>
+                <w:webHidden/>
+              </w:rPr>
+              <w:fldChar w:fldCharType="separate"/>
+            </w:r>
+            <w:r>
+              <w:rPr>
+                <w:noProof/>
+                <w:webHidden/>
+              </w:rPr>
+              <w:t>22</w:t>
+            </w:r>
+            <w:r>
+              <w:rPr>
+                <w:noProof/>
+                <w:webHidden/>
+              </w:rPr>
+              <w:fldChar w:fldCharType="end"/>
+            </w:r>
+          </w:hyperlink>
+        </w:p>
+        <w:p>
+          <w:pPr>
+            <w:pStyle w:val="TDC1"/>
+            <w:tabs>
+              <w:tab w:val="right" w:leader="dot" w:pos="9962"/>
+            </w:tabs>
+            <w:rPr>
+              <w:rFonts w:eastAsiaTheme="minorEastAsia"/>
+              <w:noProof/>
+              <w:sz w:val="24"/>
+              <w:szCs w:val="24"/>
+              <w:lang w:eastAsia="es-MX"/>
+            </w:rPr>
+          </w:pPr>
+          <w:hyperlink w:anchor="_Toc212062740" w:history="1">
             <w:r>
               <w:rPr>
                 <w:rStyle w:val="Hipervnculo"/>
@@ -2146,79 +2146,7 @@
                 <w:noProof/>
                 <w:webHidden/>
               </w:rPr>
-              <w:instrText xml:space="preserve"> PAGEREF _Toc211880610 \h </w:instrText>
-            </w:r>
-            <w:r>
-              <w:rPr>
-                <w:noProof/>
-                <w:webHidden/>
-              </w:rPr>
-            </w:r>
-            <w:r>
-              <w:rPr>
-                <w:noProof/>
-                <w:webHidden/>
-              </w:rPr>
-              <w:fldChar w:fldCharType="separate"/>
-            </w:r>
-            <w:r>
-              <w:rPr>
-                <w:noProof/>
-                <w:webHidden/>
-              </w:rPr>
-              <w:t>23</w:t>
-            </w:r>
-            <w:r>
-              <w:rPr>
-                <w:noProof/>
-                <w:webHidden/>
-              </w:rPr>
-              <w:fldChar w:fldCharType="end"/>
-            </w:r>
-          </w:hyperlink>
-        </w:p>
-        <w:p>
-          <w:pPr>
-            <w:pStyle w:val="TDC1"/>
-            <w:tabs>
-              <w:tab w:val="right" w:leader="dot" w:pos="9962"/>
-            </w:tabs>
-            <w:rPr>
-              <w:rFonts w:eastAsiaTheme="minorEastAsia"/>
-              <w:noProof/>
-              <w:sz w:val="24"/>
-              <w:szCs w:val="24"/>
-              <w:lang w:eastAsia="es-MX"/>
-            </w:rPr>
-          </w:pPr>
-          <w:hyperlink w:anchor="_Toc211880611" w:history="1">
-            <w:r>
-              <w:rPr>
-                <w:rStyle w:val="Hipervnculo"/>
-                <w:noProof/>
-              </w:rPr>
-              <w:t>Referencias bibliográficas</w:t>
-            </w:r>
-            <w:r>
-              <w:rPr>
-                <w:noProof/>
-                <w:webHidden/>
-              </w:rPr>
-              <w:tab/>
-            </w:r>
-            <w:r>
-              <w:rPr>
-                <w:noProof/>
-                <w:webHidden/>
-              </w:rPr>
-              <w:fldChar w:fldCharType="begin"/>
-            </w:r>
-            <w:r>
-              <w:rPr>
-                <w:noProof/>
-                <w:webHidden/>
-              </w:rPr>
-              <w:instrText xml:space="preserve"> PAGEREF _Toc211880611 \h </w:instrText>
+              <w:instrText xml:space="preserve"> PAGEREF _Toc212062740 \h </w:instrText>
             </w:r>
             <w:r>
               <w:rPr>
@@ -2263,7 +2191,79 @@
               <w:lang w:eastAsia="es-MX"/>
             </w:rPr>
           </w:pPr>
-          <w:hyperlink w:anchor="_Toc211880612" w:history="1">
+          <w:hyperlink w:anchor="_Toc212062741" w:history="1">
+            <w:r>
+              <w:rPr>
+                <w:rStyle w:val="Hipervnculo"/>
+                <w:noProof/>
+              </w:rPr>
+              <w:t>Referencias bibliográficas</w:t>
+            </w:r>
+            <w:r>
+              <w:rPr>
+                <w:noProof/>
+                <w:webHidden/>
+              </w:rPr>
+              <w:tab/>
+            </w:r>
+            <w:r>
+              <w:rPr>
+                <w:noProof/>
+                <w:webHidden/>
+              </w:rPr>
+              <w:fldChar w:fldCharType="begin"/>
+            </w:r>
+            <w:r>
+              <w:rPr>
+                <w:noProof/>
+                <w:webHidden/>
+              </w:rPr>
+              <w:instrText xml:space="preserve"> PAGEREF _Toc212062741 \h </w:instrText>
+            </w:r>
+            <w:r>
+              <w:rPr>
+                <w:noProof/>
+                <w:webHidden/>
+              </w:rPr>
+            </w:r>
+            <w:r>
+              <w:rPr>
+                <w:noProof/>
+                <w:webHidden/>
+              </w:rPr>
+              <w:fldChar w:fldCharType="separate"/>
+            </w:r>
+            <w:r>
+              <w:rPr>
+                <w:noProof/>
+                <w:webHidden/>
+              </w:rPr>
+              <w:t>25</w:t>
+            </w:r>
+            <w:r>
+              <w:rPr>
+                <w:noProof/>
+                <w:webHidden/>
+              </w:rPr>
+              <w:fldChar w:fldCharType="end"/>
+            </w:r>
+          </w:hyperlink>
+        </w:p>
+        <w:p>
+          <w:pPr>
+            <w:pStyle w:val="TDC1"/>
+            <w:tabs>
+              <w:tab w:val="right" w:leader="dot" w:pos="9962"/>
+            </w:tabs>
+            <w:rPr>
+              <w:rFonts w:eastAsiaTheme="minorEastAsia"/>
+              <w:noProof/>
+              <w:sz w:val="24"/>
+              <w:szCs w:val="24"/>
+              <w:lang w:eastAsia="es-MX"/>
+            </w:rPr>
+          </w:pPr>
+          <w:hyperlink w:anchor="_Toc212062742" w:history="1">
             <w:r>
               <w:rPr>
                 <w:rStyle w:val="Hipervnculo"/>
@@ -2290,7 +2290,7 @@
                 <w:noProof/>
                 <w:webHidden/>
               </w:rPr>
-              <w:instrText xml:space="preserve"> PAGEREF _Toc211880612 \h </w:instrText>
+              <w:instrText xml:space="preserve"> PAGEREF _Toc212062742 \h </w:instrText>
             </w:r>
             <w:r>
               <w:rPr>
@@ -2310,7 +2310,7 @@
                 <w:noProof/>
                 <w:webHidden/>
               </w:rPr>
-              <w:t>26</w:t>
+              <w:t>27</w:t>
             </w:r>
             <w:r>
               <w:rPr>
@@ -2347,7 +2347,7 @@
       <w:pPr>
         <w:pStyle w:val="Titulosgenerales"/>
       </w:pPr>
-      <w:bookmarkStart w:id="0" w:name="_Toc211880589"/>
+      <w:bookmarkStart w:id="0" w:name="_Toc212062719"/>
       <w:r>
         <w:lastRenderedPageBreak/>
         <w:t>Introducción</w:t>
@@ -2364,6 +2364,14 @@
         <w:t>Este componente también enfatiza el uso de herramientas de monitoreo, con un enfoque en la mejora continua y la competitividad de las organizaciones del transporte. Además, promueve la toma de decisiones informadas y la integración de políticas sectoriales en la operación. Así, se contribuye a la formación de profesionales capaces de responder a las necesidades del sector con eficiencia y sostenibilidad.</w:t>
       </w:r>
     </w:p>
+    <w:p/>
+    <w:p/>
+    <w:p/>
+    <w:p/>
+    <w:p/>
+    <w:p/>
+    <w:p/>
+    <w:p/>
     <w:p>
       <w:pPr>
         <w:pStyle w:val="Video"/>
@@ -2376,22 +2384,94 @@
         <w:rPr>
           <w:lang w:val="es-419"/>
         </w:rPr>
+        <w:lastRenderedPageBreak/>
         <w:t>Planeación y evaluación de procesos en transporte</w:t>
       </w:r>
     </w:p>
     <w:p>
       <w:pPr>
+        <w:ind w:firstLine="0"/>
         <w:jc w:val="center"/>
         <w:rPr>
           <w:lang w:val="es-419"/>
         </w:rPr>
       </w:pPr>
       <w:r>
-        <w:rPr>
-          <w:highlight w:val="yellow"/>
-          <w:lang w:val="es-419"/>
-        </w:rPr>
-        <w:t>FALTA VIDEO</w:t>
+        <w:fldChar w:fldCharType="begin"/>
+      </w:r>
+      <w:r>
+        <w:instrText xml:space="preserve"> INCLUDEPICTURE "https://img.youtube.com/vi/zD6prKIIWxg/maxresdefault.jpg" \* MERGEFORMATINET </w:instrText>
+      </w:r>
+      <w:r>
+        <w:fldChar w:fldCharType="separate"/>
+      </w:r>
+      <w:r>
+        <w:rPr>
+          <w:noProof/>
+        </w:rPr>
+        <w:drawing>
+          <wp:inline distT="0" distB="0" distL="0" distR="0" wp14:anchorId="068D1CC0" wp14:editId="4D7AFA83">
+            <wp:extent cx="5009157" cy="2817525"/>
+            <wp:effectExtent l="0" t="0" r="0" b="1905"/>
+            <wp:docPr id="519818400" name="Imagen 4">
+              <a:extLst xmlns:a="http://schemas.openxmlformats.org/drawingml/2006/main">
+                <a:ext uri="{C183D7F6-B498-43B3-948B-1728B52AA6E4}">
+                  <adec:decorative xmlns:adec="http://schemas.microsoft.com/office/drawing/2017/decorative" val="1"/>
+                </a:ext>
+              </a:extLst>
+            </wp:docPr>
+            <wp:cNvGraphicFramePr>
+              <a:graphicFrameLocks xmlns:a="http://schemas.openxmlformats.org/drawingml/2006/main" noChangeAspect="1"/>
+            </wp:cNvGraphicFramePr>
+            <a:graphic xmlns:a="http://schemas.openxmlformats.org/drawingml/2006/main">
+              <a:graphicData uri="http://schemas.openxmlformats.org/drawingml/2006/picture">
+                <pic:pic xmlns:pic="http://schemas.openxmlformats.org/drawingml/2006/picture">
+                  <pic:nvPicPr>
+                    <pic:cNvPr id="519818400" name="Imagen 4">
+                      <a:extLst>
+                        <a:ext uri="{C183D7F6-B498-43B3-948B-1728B52AA6E4}">
+                          <adec:decorative xmlns:adec="http://schemas.microsoft.com/office/drawing/2017/decorative" val="1"/>
+                        </a:ext>
+                      </a:extLst>
+                    </pic:cNvPr>
+                    <pic:cNvPicPr>
+                      <a:picLocks noChangeAspect="1" noChangeArrowheads="1"/>
+                    </pic:cNvPicPr>
+                  </pic:nvPicPr>
+                  <pic:blipFill>
+                    <a:blip r:embed="rId13" cstate="print">
+                      <a:extLst>
+                        <a:ext uri="{28A0092B-C50C-407E-A947-70E740481C1C}">
+                          <a14:useLocalDpi xmlns:a14="http://schemas.microsoft.com/office/drawing/2010/main" val="0"/>
+                        </a:ext>
+                      </a:extLst>
+                    </a:blip>
+                    <a:srcRect/>
+                    <a:stretch>
+                      <a:fillRect/>
+                    </a:stretch>
+                  </pic:blipFill>
+                  <pic:spPr bwMode="auto">
+                    <a:xfrm>
+                      <a:off x="0" y="0"/>
+                      <a:ext cx="5068520" cy="2850915"/>
+                    </a:xfrm>
+                    <a:prstGeom prst="rect">
+                      <a:avLst/>
+                    </a:prstGeom>
+                    <a:noFill/>
+                    <a:ln>
+                      <a:noFill/>
+                    </a:ln>
+                  </pic:spPr>
+                </pic:pic>
+              </a:graphicData>
+            </a:graphic>
+          </wp:inline>
+        </w:drawing>
+      </w:r>
+      <w:r>
+        <w:fldChar w:fldCharType="end"/>
       </w:r>
     </w:p>
     <w:p>
@@ -2433,14 +2513,17 @@
           <w:lang w:val="es-419"/>
         </w:rPr>
       </w:pPr>
-      <w:r>
-        <w:rPr>
-          <w:b/>
-          <w:bCs/>
-          <w:lang w:val="es-419"/>
-        </w:rPr>
-        <w:t>Enlace de reproducción del video</w:t>
-      </w:r>
+      <w:hyperlink r:id="rId14" w:history="1">
+        <w:r>
+          <w:rPr>
+            <w:rStyle w:val="Hipervnculo"/>
+            <w:b/>
+            <w:bCs/>
+            <w:lang w:val="es-419"/>
+          </w:rPr>
+          <w:t>Enlace de reproducción del video</w:t>
+        </w:r>
+      </w:hyperlink>
       <w:r>
         <w:rPr>
           <w:b/>
@@ -2515,11 +2598,7 @@
           </w:p>
           <w:p>
             <w:r>
-              <w:t xml:space="preserve">Le damos la bienvenida al componente formativo “Planeación y evaluación de procesos operativos en transporte”. Este espacio académico permitirá comprender </w:t>
-            </w:r>
-            <w:r>
-              <w:lastRenderedPageBreak/>
-              <w:t>los fundamentos del transporte y su marco operativo, iniciando con el análisis de su concepto, evolución y relevancia en la dinámica logística.</w:t>
+              <w:t>Le damos la bienvenida al componente formativo “Planeación y evaluación de procesos operativos en transporte”. Este espacio académico permitirá comprender los fundamentos del transporte y su marco operativo, iniciando con el análisis de su concepto, evolución y relevancia en la dinámica logística.</w:t>
             </w:r>
           </w:p>
           <w:p>
@@ -2529,6 +2608,7 @@
           </w:p>
           <w:p>
             <w:r>
+              <w:lastRenderedPageBreak/>
               <w:t>El recorrido incluye la normativa y las políticas que regulan el sector, aspecto indispensable para garantizar operaciones seguras, legales y sostenibles. Seguidamente, se abordarán los indicadores de gestión, métricas clave que permiten medir el desempeño, detectar desviaciones y apoyar la toma de decisiones.</w:t>
             </w:r>
           </w:p>
@@ -2539,6 +2619,7 @@
             <w:r>
               <w:rPr>
                 <w:rStyle w:val="Extranjerismo"/>
+                <w:lang w:val="es-CO"/>
               </w:rPr>
               <w:t>software</w:t>
             </w:r>
@@ -2562,19 +2643,30 @@
     <w:p>
       <w:pPr>
         <w:widowControl w:val="0"/>
+        <w:ind w:firstLine="0"/>
         <w:rPr>
           <w:rFonts w:ascii="Calibri" w:hAnsi="Calibri" w:cs="Calibri"/>
           <w:szCs w:val="28"/>
           <w:lang w:val="es-419"/>
         </w:rPr>
       </w:pPr>
-      <w:r>
+    </w:p>
+    <w:p>
+      <w:pPr>
+        <w:spacing w:before="0" w:after="160" w:line="259" w:lineRule="auto"/>
+        <w:ind w:firstLine="0"/>
         <w:rPr>
           <w:rFonts w:ascii="Calibri" w:hAnsi="Calibri" w:cs="Calibri"/>
           <w:szCs w:val="28"/>
           <w:lang w:val="es-419"/>
         </w:rPr>
-        <w:lastRenderedPageBreak/>
+      </w:pPr>
+      <w:r>
+        <w:rPr>
+          <w:rFonts w:ascii="Calibri" w:hAnsi="Calibri" w:cs="Calibri"/>
+          <w:szCs w:val="28"/>
+          <w:lang w:val="es-419"/>
+        </w:rPr>
         <w:br w:type="page"/>
       </w:r>
     </w:p>
@@ -2582,7 +2674,7 @@
       <w:pPr>
         <w:pStyle w:val="Ttulo1"/>
       </w:pPr>
-      <w:bookmarkStart w:id="1" w:name="_Toc211880590"/>
+      <w:bookmarkStart w:id="1" w:name="_Toc212062720"/>
       <w:r>
         <w:lastRenderedPageBreak/>
         <w:t>Transporte</w:t>
@@ -2619,7 +2711,7 @@
           <w:rFonts w:eastAsia="Times New Roman"/>
         </w:rPr>
       </w:pPr>
-      <w:bookmarkStart w:id="2" w:name="_Toc211880591"/>
+      <w:bookmarkStart w:id="2" w:name="_Toc212062721"/>
       <w:r>
         <w:t>Concepto</w:t>
       </w:r>
@@ -2655,7 +2747,7 @@
       <w:pPr>
         <w:pStyle w:val="Ttulo2"/>
       </w:pPr>
-      <w:bookmarkStart w:id="3" w:name="_Toc211880592"/>
+      <w:bookmarkStart w:id="3" w:name="_Toc212062722"/>
       <w:r>
         <w:t>1.2 Tipos y características</w:t>
       </w:r>
@@ -2769,7 +2861,7 @@
       <w:pPr>
         <w:pStyle w:val="Ttulo2"/>
       </w:pPr>
-      <w:bookmarkStart w:id="4" w:name="_Toc211880593"/>
+      <w:bookmarkStart w:id="4" w:name="_Toc212062723"/>
       <w:r>
         <w:lastRenderedPageBreak/>
         <w:t>1.3 Normativa y políticas del sector</w:t>
@@ -2983,7 +3075,7 @@
       <w:pPr>
         <w:pStyle w:val="Ttulo2"/>
       </w:pPr>
-      <w:bookmarkStart w:id="5" w:name="_Toc211880594"/>
+      <w:bookmarkStart w:id="5" w:name="_Toc212062724"/>
       <w:r>
         <w:t>1.4 Objetivos de la organización</w:t>
       </w:r>
@@ -3133,7 +3225,7 @@
         <w:lastRenderedPageBreak/>
         <w:t xml:space="preserve"> </w:t>
       </w:r>
-      <w:bookmarkStart w:id="6" w:name="_Toc211880595"/>
+      <w:bookmarkStart w:id="6" w:name="_Toc212062725"/>
       <w:r>
         <w:t>Indicadores de gestión</w:t>
       </w:r>
@@ -3187,7 +3279,7 @@
       <w:pPr>
         <w:pStyle w:val="Ttulo2"/>
       </w:pPr>
-      <w:bookmarkStart w:id="7" w:name="_Toc211880596"/>
+      <w:bookmarkStart w:id="7" w:name="_Toc212062726"/>
       <w:r>
         <w:t>2.1 Concepto</w:t>
       </w:r>
@@ -3210,7 +3302,7 @@
       <w:pPr>
         <w:pStyle w:val="Ttulo2"/>
       </w:pPr>
-      <w:bookmarkStart w:id="8" w:name="_Toc211880597"/>
+      <w:bookmarkStart w:id="8" w:name="_Toc212062727"/>
       <w:r>
         <w:t>2.2 Elementos</w:t>
       </w:r>
@@ -3421,7 +3513,7 @@
       <w:pPr>
         <w:pStyle w:val="Ttulo2"/>
       </w:pPr>
-      <w:bookmarkStart w:id="9" w:name="_Toc211880598"/>
+      <w:bookmarkStart w:id="9" w:name="_Toc212062728"/>
       <w:r>
         <w:t>2.3 Características</w:t>
       </w:r>
@@ -3692,6 +3784,9 @@
       </w:r>
     </w:p>
     <w:p>
+      <w:pPr>
+        <w:jc w:val="center"/>
+      </w:pPr>
       <w:r>
         <w:rPr>
           <w:noProof/>
@@ -3712,7 +3807,7 @@
                     <pic:cNvPicPr/>
                   </pic:nvPicPr>
                   <pic:blipFill>
-                    <a:blip r:embed="rId13"/>
+                    <a:blip r:embed="rId15"/>
                     <a:stretch>
                       <a:fillRect/>
                     </a:stretch>
@@ -4015,7 +4110,7 @@
       <w:pPr>
         <w:pStyle w:val="Ttulo1"/>
       </w:pPr>
-      <w:bookmarkStart w:id="10" w:name="_Toc211880599"/>
+      <w:bookmarkStart w:id="10" w:name="_Toc212062729"/>
       <w:r>
         <w:lastRenderedPageBreak/>
         <w:t>Monitoreo del transporte</w:t>
@@ -4039,7 +4134,7 @@
       <w:pPr>
         <w:pStyle w:val="Ttulo2"/>
       </w:pPr>
-      <w:bookmarkStart w:id="11" w:name="_Toc211880600"/>
+      <w:bookmarkStart w:id="11" w:name="_Toc212062730"/>
       <w:r>
         <w:t>3.1 Concepto</w:t>
       </w:r>
@@ -4244,7 +4339,7 @@
       <w:pPr>
         <w:pStyle w:val="Ttulo2"/>
       </w:pPr>
-      <w:bookmarkStart w:id="12" w:name="_Toc211880601"/>
+      <w:bookmarkStart w:id="12" w:name="_Toc212062731"/>
       <w:r>
         <w:t>3.2 Elementos</w:t>
       </w:r>
@@ -4443,7 +4538,7 @@
       <w:pPr>
         <w:pStyle w:val="Ttulo2"/>
       </w:pPr>
-      <w:bookmarkStart w:id="13" w:name="_Toc211880602"/>
+      <w:bookmarkStart w:id="13" w:name="_Toc212062732"/>
       <w:r>
         <w:t>3.3 Características</w:t>
       </w:r>
@@ -4984,7 +5079,7 @@
       <w:pPr>
         <w:pStyle w:val="Ttulo2"/>
       </w:pPr>
-      <w:bookmarkStart w:id="14" w:name="_Toc211880603"/>
+      <w:bookmarkStart w:id="14" w:name="_Toc212062733"/>
       <w:r>
         <w:t>3.4 Pasos</w:t>
       </w:r>
@@ -5275,7 +5370,7 @@
       <w:pPr>
         <w:pStyle w:val="Ttulo1"/>
       </w:pPr>
-      <w:bookmarkStart w:id="15" w:name="_Toc211880604"/>
+      <w:bookmarkStart w:id="15" w:name="_Toc212062734"/>
       <w:r>
         <w:lastRenderedPageBreak/>
         <w:t>Herramientas de monitoreo</w:t>
@@ -5299,7 +5394,7 @@
       <w:pPr>
         <w:pStyle w:val="Ttulo2"/>
       </w:pPr>
-      <w:bookmarkStart w:id="16" w:name="_Toc211880605"/>
+      <w:bookmarkStart w:id="16" w:name="_Toc212062735"/>
       <w:r>
         <w:t>4.1 Concepto</w:t>
       </w:r>
@@ -5320,6 +5415,7 @@
       <w:r>
         <w:rPr>
           <w:rStyle w:val="Extranjerismo"/>
+          <w:lang w:val="es-CO"/>
         </w:rPr>
         <w:t xml:space="preserve"> hardware</w:t>
       </w:r>
@@ -5332,6 +5428,7 @@
       <w:r>
         <w:rPr>
           <w:rStyle w:val="Extranjerismo"/>
+          <w:lang w:val="es-CO"/>
         </w:rPr>
         <w:t>software</w:t>
       </w:r>
@@ -5346,7 +5443,7 @@
       <w:pPr>
         <w:pStyle w:val="Ttulo2"/>
       </w:pPr>
-      <w:bookmarkStart w:id="17" w:name="_Toc211880606"/>
+      <w:bookmarkStart w:id="17" w:name="_Toc212062736"/>
       <w:r>
         <w:t xml:space="preserve">4.2 </w:t>
       </w:r>
@@ -5385,15 +5482,7 @@
           <w:bCs/>
           <w:lang w:val="es-419" w:eastAsia="es-CO"/>
         </w:rPr>
-        <w:t>Sistemas de gestión de almacenes (WMS)</w:t>
-      </w:r>
-      <w:r>
-        <w:rPr>
-          <w:b/>
-          <w:bCs/>
-          <w:lang w:val="es-419" w:eastAsia="es-CO"/>
-        </w:rPr>
-        <w:t>:</w:t>
+        <w:t>Sistemas de gestión de almacenes (WMS):</w:t>
       </w:r>
       <w:r>
         <w:rPr>
@@ -5459,15 +5548,7 @@
           <w:bCs/>
           <w:lang w:val="es-419" w:eastAsia="es-CO"/>
         </w:rPr>
-        <w:t>Sistemas de gestión de transporte (TMS)</w:t>
-      </w:r>
-      <w:r>
-        <w:rPr>
-          <w:b/>
-          <w:bCs/>
-          <w:lang w:val="es-419" w:eastAsia="es-CO"/>
-        </w:rPr>
-        <w:t>:</w:t>
+        <w:t>Sistemas de gestión de transporte (TMS):</w:t>
       </w:r>
       <w:r>
         <w:rPr>
@@ -5513,27 +5594,13 @@
           <w:bCs/>
           <w:lang w:val="es-419" w:eastAsia="es-CO"/>
         </w:rPr>
-        <w:t>Sistemas de rastreo y telemetría</w:t>
+        <w:t>Sistemas de rastreo y telemetría:</w:t>
       </w:r>
       <w:r>
         <w:rPr>
-          <w:b/>
-          <w:bCs/>
           <w:lang w:val="es-419" w:eastAsia="es-CO"/>
         </w:rPr>
-        <w:t>:</w:t>
-      </w:r>
-      <w:r>
-        <w:rPr>
-          <w:lang w:val="es-419" w:eastAsia="es-CO"/>
-        </w:rPr>
-        <w:t xml:space="preserve"> t</w:t>
-      </w:r>
-      <w:r>
-        <w:rPr>
-          <w:lang w:val="es-419" w:eastAsia="es-CO"/>
-        </w:rPr>
-        <w:t xml:space="preserve">ecnologías como GPS, RFID e </w:t>
+        <w:t xml:space="preserve"> tecnologías como GPS, RFID e </w:t>
       </w:r>
       <w:r>
         <w:rPr>
@@ -5566,27 +5633,13 @@
           <w:bCs/>
           <w:lang w:val="es-419" w:eastAsia="es-CO"/>
         </w:rPr>
-        <w:t>Torres de control logístico</w:t>
+        <w:t>Torres de control logístico:</w:t>
       </w:r>
       <w:r>
         <w:rPr>
-          <w:b/>
-          <w:bCs/>
           <w:lang w:val="es-419" w:eastAsia="es-CO"/>
         </w:rPr>
-        <w:t>:</w:t>
-      </w:r>
-      <w:r>
-        <w:rPr>
-          <w:lang w:val="es-419" w:eastAsia="es-CO"/>
-        </w:rPr>
-        <w:t xml:space="preserve"> p</w:t>
-      </w:r>
-      <w:r>
-        <w:rPr>
-          <w:lang w:val="es-419" w:eastAsia="es-CO"/>
-        </w:rPr>
-        <w:t>lataformas que integran información de diferentes fuentes (WMS, TMS o transportistas). Proporcionan una visión global de la cadena de suministro y facilitan decisiones centralizadas.</w:t>
+        <w:t xml:space="preserve"> plataformas que integran información de diferentes fuentes (WMS, TMS o transportistas). Proporcionan una visión global de la cadena de suministro y facilitan decisiones centralizadas.</w:t>
       </w:r>
     </w:p>
     <w:p>
@@ -5606,15 +5659,7 @@
           <w:bCs/>
           <w:lang w:val="es-419" w:eastAsia="es-CO"/>
         </w:rPr>
-        <w:t>Tecnologías de sensores</w:t>
-      </w:r>
-      <w:r>
-        <w:rPr>
-          <w:b/>
-          <w:bCs/>
-          <w:lang w:val="es-419" w:eastAsia="es-CO"/>
-        </w:rPr>
-        <w:t>:</w:t>
+        <w:t>Tecnologías de sensores:</w:t>
       </w:r>
       <w:r>
         <w:rPr>
@@ -5633,7 +5678,7 @@
       <w:pPr>
         <w:pStyle w:val="Ttulo2"/>
       </w:pPr>
-      <w:bookmarkStart w:id="18" w:name="_Toc211880607"/>
+      <w:bookmarkStart w:id="18" w:name="_Toc212062737"/>
       <w:r>
         <w:t>4.3 Características</w:t>
       </w:r>
@@ -5858,7 +5903,7 @@
       <w:pPr>
         <w:pStyle w:val="Titulosgenerales"/>
       </w:pPr>
-      <w:bookmarkStart w:id="19" w:name="_Toc211880608"/>
+      <w:bookmarkStart w:id="19" w:name="_Toc212062738"/>
       <w:r>
         <w:lastRenderedPageBreak/>
         <w:t>Síntesis</w:t>
@@ -5902,6 +5947,7 @@
     </w:p>
     <w:p>
       <w:pPr>
+        <w:jc w:val="center"/>
         <w:rPr>
           <w:lang w:val="es-419" w:eastAsia="es-CO"/>
         </w:rPr>
@@ -5927,7 +5973,7 @@
                     <pic:cNvPicPr/>
                   </pic:nvPicPr>
                   <pic:blipFill>
-                    <a:blip r:embed="rId14"/>
+                    <a:blip r:embed="rId16"/>
                     <a:stretch>
                       <a:fillRect/>
                     </a:stretch>
@@ -5960,7 +6006,7 @@
       <w:pPr>
         <w:pStyle w:val="Titulosgenerales"/>
       </w:pPr>
-      <w:bookmarkStart w:id="20" w:name="_Toc211880609"/>
+      <w:bookmarkStart w:id="20" w:name="_Toc212062739"/>
       <w:r>
         <w:lastRenderedPageBreak/>
         <w:t>Glosario</w:t>
@@ -6588,7 +6634,7 @@
       <w:pPr>
         <w:pStyle w:val="Titulosgenerales"/>
       </w:pPr>
-      <w:bookmarkStart w:id="21" w:name="_Toc211880610"/>
+      <w:bookmarkStart w:id="21" w:name="_Toc212062740"/>
       <w:r>
         <w:lastRenderedPageBreak/>
         <w:t>Material complementario</w:t>
@@ -6785,7 +6831,7 @@
                 <w:szCs w:val="28"/>
               </w:rPr>
             </w:pPr>
-            <w:hyperlink r:id="rId15" w:history="1">
+            <w:hyperlink r:id="rId17" w:history="1">
               <w:r>
                 <w:rPr>
                   <w:rStyle w:val="Hipervnculo"/>
@@ -6881,7 +6927,7 @@
                 <w:u w:val="none"/>
               </w:rPr>
             </w:pPr>
-            <w:hyperlink r:id="rId16" w:history="1">
+            <w:hyperlink r:id="rId18" w:history="1">
               <w:r>
                 <w:rPr>
                   <w:rStyle w:val="Hipervnculo"/>
@@ -6975,7 +7021,7 @@
                 <w:szCs w:val="28"/>
               </w:rPr>
             </w:pPr>
-            <w:hyperlink r:id="rId17" w:history="1">
+            <w:hyperlink r:id="rId19" w:history="1">
               <w:r>
                 <w:rPr>
                   <w:rStyle w:val="Hipervnculo"/>
@@ -6999,7 +7045,7 @@
       <w:pPr>
         <w:pStyle w:val="Titulosgenerales"/>
       </w:pPr>
-      <w:bookmarkStart w:id="22" w:name="_Toc211880611"/>
+      <w:bookmarkStart w:id="22" w:name="_Toc212062741"/>
       <w:r>
         <w:lastRenderedPageBreak/>
         <w:t>Referencias bibliográficas</w:t>
@@ -7023,7 +7069,7 @@
         </w:rPr>
         <w:t xml:space="preserve">Colombia. Congreso de la República. (1996). Ley 336 de 1996: Por la cual se adopta el Estatuto Nacional de Transporte. </w:t>
       </w:r>
-      <w:hyperlink r:id="rId18" w:history="1">
+      <w:hyperlink r:id="rId20" w:history="1">
         <w:r>
           <w:rPr>
             <w:rStyle w:val="Hipervnculo"/>
@@ -7047,7 +7093,7 @@
         </w:rPr>
         <w:t xml:space="preserve">Colombia. Ministerio de Transporte. (2001). Decreto 173 de 2001: Por el cual se reglamenta el Servicio Público de Transporte Terrestre Automotor de Carga. </w:t>
       </w:r>
-      <w:hyperlink r:id="rId19" w:history="1">
+      <w:hyperlink r:id="rId21" w:history="1">
         <w:r>
           <w:rPr>
             <w:rStyle w:val="Hipervnculo"/>
@@ -7071,7 +7117,7 @@
         </w:rPr>
         <w:t xml:space="preserve">Colombia. Ministerio de Transporte. (2002). Decreto 1609 de 2002: Por el cual se reglamenta el manejo y transporte terrestre automotor de mercancías peligrosas por carretera. </w:t>
       </w:r>
-      <w:hyperlink r:id="rId20" w:history="1">
+      <w:hyperlink r:id="rId22" w:history="1">
         <w:r>
           <w:rPr>
             <w:rStyle w:val="Hipervnculo"/>
@@ -7111,7 +7157,7 @@
         </w:rPr>
         <w:t xml:space="preserve"> Ediciones. </w:t>
       </w:r>
-      <w:hyperlink r:id="rId21" w:history="1">
+      <w:hyperlink r:id="rId23" w:history="1">
         <w:r>
           <w:rPr>
             <w:rStyle w:val="Hipervnculo"/>
@@ -7151,7 +7197,7 @@
         </w:rPr>
         <w:t xml:space="preserve"> Ediciones. </w:t>
       </w:r>
-      <w:hyperlink r:id="rId22" w:history="1">
+      <w:hyperlink r:id="rId24" w:history="1">
         <w:r>
           <w:rPr>
             <w:rStyle w:val="Hipervnculo"/>
@@ -7191,7 +7237,7 @@
         </w:rPr>
         <w:t xml:space="preserve"> de cargas a nivel nacional [Trabajo de grado, Universidad Militar Nueva Granada]. Repositorio Institucional UMNG. </w:t>
       </w:r>
-      <w:hyperlink r:id="rId23" w:history="1">
+      <w:hyperlink r:id="rId25" w:history="1">
         <w:r>
           <w:rPr>
             <w:rStyle w:val="Hipervnculo"/>
@@ -7232,7 +7278,7 @@
         </w:rPr>
         <w:t xml:space="preserve"> Ediciones Ltda. </w:t>
       </w:r>
-      <w:hyperlink r:id="rId24" w:history="1">
+      <w:hyperlink r:id="rId26" w:history="1">
         <w:r>
           <w:rPr>
             <w:rStyle w:val="Hipervnculo"/>
@@ -7270,7 +7316,7 @@
       <w:pPr>
         <w:pStyle w:val="Titulosgenerales"/>
       </w:pPr>
-      <w:bookmarkStart w:id="23" w:name="_Toc211880612"/>
+      <w:bookmarkStart w:id="23" w:name="_Toc212062742"/>
       <w:r>
         <w:lastRenderedPageBreak/>
         <w:t>C</w:t>
@@ -8340,8 +8386,8 @@
       </w:pPr>
     </w:p>
     <w:sectPr>
-      <w:headerReference w:type="default" r:id="rId25"/>
-      <w:footerReference w:type="default" r:id="rId26"/>
+      <w:headerReference w:type="default" r:id="rId27"/>
+      <w:footerReference w:type="default" r:id="rId28"/>
       <w:pgSz w:w="12240" w:h="15840"/>
       <w:pgMar w:top="1701" w:right="1134" w:bottom="1134" w:left="1134" w:header="709" w:footer="737" w:gutter="0"/>
       <w:pgNumType w:start="1"/>
@@ -40590,15 +40636,6 @@
 </file>
 
 <file path=customXml/item1.xml><?xml version="1.0" encoding="utf-8"?>
-<?mso-contentType ?>
-<FormTemplates xmlns="http://schemas.microsoft.com/sharepoint/v3/contenttype/forms">
-  <Display>DocumentLibraryForm</Display>
-  <Edit>DocumentLibraryForm</Edit>
-  <New>DocumentLibraryForm</New>
-</FormTemplates>
-</file>
-
-<file path=customXml/item2.xml><?xml version="1.0" encoding="utf-8"?>
 <p:properties xmlns:p="http://schemas.microsoft.com/office/2006/metadata/properties" xmlns:xsi="http://www.w3.org/2001/XMLSchema-instance" xmlns:pc="http://schemas.microsoft.com/office/infopath/2007/PartnerControls">
   <documentManagement>
     <TaxCatchAll xmlns="adccf511-daff-4bcb-9072-914cedbf4c7e" xsi:nil="true"/>
@@ -40609,11 +40646,16 @@
 </p:properties>
 </file>
 
-<file path=customXml/item3.xml><?xml version="1.0" encoding="utf-8"?>
-<b:Sources xmlns:b="http://schemas.openxmlformats.org/officeDocument/2006/bibliography" xmlns="http://schemas.openxmlformats.org/officeDocument/2006/bibliography" SelectedStyle="\APASixthEditionOfficeOnline.xsl" StyleName="APA" Version="6"/>
+<file path=customXml/item2.xml><?xml version="1.0" encoding="utf-8"?>
+<?mso-contentType ?>
+<FormTemplates xmlns="http://schemas.microsoft.com/sharepoint/v3/contenttype/forms">
+  <Display>DocumentLibraryForm</Display>
+  <Edit>DocumentLibraryForm</Edit>
+  <New>DocumentLibraryForm</New>
+</FormTemplates>
 </file>
 
-<file path=customXml/item4.xml><?xml version="1.0" encoding="utf-8"?>
+<file path=customXml/item3.xml><?xml version="1.0" encoding="utf-8"?>
 <ct:contentTypeSchema xmlns:ct="http://schemas.microsoft.com/office/2006/metadata/contentType" xmlns:ma="http://schemas.microsoft.com/office/2006/metadata/properties/metaAttributes" ct:_="" ma:_="" ma:contentTypeName="Documento" ma:contentTypeID="0x010100FC2B1768DD5A774EB396CCAB0DE361C1" ma:contentTypeVersion="12" ma:contentTypeDescription="Crear nuevo documento." ma:contentTypeScope="" ma:versionID="73bbb3c317121ea3087ce0564dba81cf">
   <xsd:schema xmlns:xsd="http://www.w3.org/2001/XMLSchema" xmlns:xs="http://www.w3.org/2001/XMLSchema" xmlns:p="http://schemas.microsoft.com/office/2006/metadata/properties" xmlns:ns2="a70d3c18-0869-45a1-9f75-4b4b8f0f32be" xmlns:ns3="adccf511-daff-4bcb-9072-914cedbf4c7e" targetNamespace="http://schemas.microsoft.com/office/2006/metadata/properties" ma:root="true" ma:fieldsID="89b5199a66abea40ca7ec6b263fc5e35" ns2:_="" ns3:_="">
     <xsd:import namespace="a70d3c18-0869-45a1-9f75-4b4b8f0f32be"/>
@@ -40814,15 +40856,11 @@
 </ct:contentTypeSchema>
 </file>
 
-<file path=customXml/itemProps1.xml><?xml version="1.0" encoding="utf-8"?>
-<ds:datastoreItem xmlns:ds="http://schemas.openxmlformats.org/officeDocument/2006/customXml" ds:itemID="{81CBDEC1-3B00-44ED-AD36-0268077980BA}">
-  <ds:schemaRefs>
-    <ds:schemaRef ds:uri="http://schemas.microsoft.com/sharepoint/v3/contenttype/forms"/>
-  </ds:schemaRefs>
-</ds:datastoreItem>
+<file path=customXml/item4.xml><?xml version="1.0" encoding="utf-8"?>
+<b:Sources xmlns:b="http://schemas.openxmlformats.org/officeDocument/2006/bibliography" xmlns="http://schemas.openxmlformats.org/officeDocument/2006/bibliography" SelectedStyle="\APASixthEditionOfficeOnline.xsl" StyleName="APA" Version="6"/>
 </file>
 
-<file path=customXml/itemProps2.xml><?xml version="1.0" encoding="utf-8"?>
+<file path=customXml/itemProps1.xml><?xml version="1.0" encoding="utf-8"?>
 <ds:datastoreItem xmlns:ds="http://schemas.openxmlformats.org/officeDocument/2006/customXml" ds:itemID="{6929C9FE-9F22-4B98-96EF-1B541B3BD0B2}">
   <ds:schemaRefs>
     <ds:schemaRef ds:uri="http://schemas.microsoft.com/office/2006/metadata/properties"/>
@@ -40833,14 +40871,22 @@
 </ds:datastoreItem>
 </file>
 
+<file path=customXml/itemProps2.xml><?xml version="1.0" encoding="utf-8"?>
+<ds:datastoreItem xmlns:ds="http://schemas.openxmlformats.org/officeDocument/2006/customXml" ds:itemID="{81CBDEC1-3B00-44ED-AD36-0268077980BA}">
+  <ds:schemaRefs>
+    <ds:schemaRef ds:uri="http://schemas.microsoft.com/sharepoint/v3/contenttype/forms"/>
+  </ds:schemaRefs>
+</ds:datastoreItem>
+</file>
+
 <file path=customXml/itemProps3.xml><?xml version="1.0" encoding="utf-8"?>
+<ds:datastoreItem xmlns:ds="http://schemas.openxmlformats.org/officeDocument/2006/customXml" ds:itemID="{A47599F0-9BDB-49ED-90DD-9B9DFD1311AD}"/>
+</file>
+
+<file path=customXml/itemProps4.xml><?xml version="1.0" encoding="utf-8"?>
 <ds:datastoreItem xmlns:ds="http://schemas.openxmlformats.org/officeDocument/2006/customXml" ds:itemID="{E8AB44A3-7C62-4BD2-82ED-8ABC209970FA}">
   <ds:schemaRefs>
     <ds:schemaRef ds:uri="http://schemas.openxmlformats.org/officeDocument/2006/bibliography"/>
   </ds:schemaRefs>
 </ds:datastoreItem>
-</file>
-
-<file path=customXml/itemProps4.xml><?xml version="1.0" encoding="utf-8"?>
-<ds:datastoreItem xmlns:ds="http://schemas.openxmlformats.org/officeDocument/2006/customXml" ds:itemID="{61252284-A61C-4E09-9999-9DEC07DDE1FC}"/>
 </file>
</xml_diff>

<commit_message>
Agregado CFA con ajustes de repositorio pendientes
</commit_message>
<xml_diff>
--- a/fuentes/CFA1_12150026_DU.docx
+++ b/fuentes/CFA1_12150026_DU.docx
@@ -2425,7 +2425,7 @@
           <w:noProof/>
         </w:rPr>
         <w:drawing>
-          <wp:inline distT="0" distB="0" distL="0" distR="0" wp14:anchorId="068D1CC0" wp14:editId="63811825">
+          <wp:inline distT="0" distB="0" distL="0" distR="0" wp14:anchorId="068D1CC0" wp14:editId="34D74710">
             <wp:extent cx="5009157" cy="2817525"/>
             <wp:effectExtent l="0" t="0" r="0" b="1905"/>
             <wp:docPr id="519818400" name="Imagen 4">
@@ -4977,7 +4977,19 @@
         <w:rPr>
           <w:lang w:val="es-419" w:eastAsia="es-CO"/>
         </w:rPr>
-        <w:t xml:space="preserve"> prueba electrónica de entrega (POD) con fotos y firmas, aumentando confianza y veracidad de la entrega.</w:t>
+        <w:t xml:space="preserve"> prueba electrónica de entrega (POD) con fotos y firmas, aumentando </w:t>
+      </w:r>
+      <w:r>
+        <w:rPr>
+          <w:lang w:val="es-419" w:eastAsia="es-CO"/>
+        </w:rPr>
+        <w:t xml:space="preserve">la </w:t>
+      </w:r>
+      <w:r>
+        <w:rPr>
+          <w:lang w:val="es-419" w:eastAsia="es-CO"/>
+        </w:rPr>
+        <w:t>confianza y veracidad de la entrega.</w:t>
       </w:r>
       <w:r>
         <w:rPr>
@@ -5949,6 +5961,7 @@
       </w:pPr>
       <w:r>
         <w:rPr>
+          <w:noProof/>
           <w:lang w:val="es-419" w:eastAsia="es-CO"/>
         </w:rPr>
         <w:drawing>
@@ -39463,6 +39476,7 @@
   <w:style w:type="character" w:default="1" w:styleId="Fuentedeprrafopredeter">
     <w:name w:val="Default Paragraph Font"/>
     <w:uiPriority w:val="1"/>
+    <w:semiHidden/>
     <w:unhideWhenUsed/>
   </w:style>
   <w:style w:type="table" w:default="1" w:styleId="Tablanormal">
@@ -40626,6 +40640,10 @@
 </file>
 
 <file path=customXml/item1.xml><?xml version="1.0" encoding="utf-8"?>
+<b:Sources xmlns:b="http://schemas.openxmlformats.org/officeDocument/2006/bibliography" xmlns="http://schemas.openxmlformats.org/officeDocument/2006/bibliography" SelectedStyle="\APASixthEditionOfficeOnline.xsl" StyleName="APA" Version="6"/>
+</file>
+
+<file path=customXml/item2.xml><?xml version="1.0" encoding="utf-8"?>
 <ct:contentTypeSchema xmlns:ct="http://schemas.microsoft.com/office/2006/metadata/contentType" xmlns:ma="http://schemas.microsoft.com/office/2006/metadata/properties/metaAttributes" ct:_="" ma:_="" ma:contentTypeName="Documento" ma:contentTypeID="0x010100FC2B1768DD5A774EB396CCAB0DE361C1" ma:contentTypeVersion="12" ma:contentTypeDescription="Crear nuevo documento." ma:contentTypeScope="" ma:versionID="d4a546b22d2924edabf51241cf3422b8">
   <xsd:schema xmlns:xsd="http://www.w3.org/2001/XMLSchema" xmlns:xs="http://www.w3.org/2001/XMLSchema" xmlns:p="http://schemas.microsoft.com/office/2006/metadata/properties" xmlns:ns2="a70d3c18-0869-45a1-9f75-4b4b8f0f32be" xmlns:ns3="adccf511-daff-4bcb-9072-914cedbf4c7e" targetNamespace="http://schemas.microsoft.com/office/2006/metadata/properties" ma:root="true" ma:fieldsID="e29002b2d9ca820e89c57fc59ec70c79" ns2:_="" ns3:_="">
     <xsd:import namespace="a70d3c18-0869-45a1-9f75-4b4b8f0f32be"/>
@@ -40826,11 +40844,16 @@
 </ct:contentTypeSchema>
 </file>
 
-<file path=customXml/item2.xml><?xml version="1.0" encoding="utf-8"?>
-<b:Sources xmlns:b="http://schemas.openxmlformats.org/officeDocument/2006/bibliography" xmlns="http://schemas.openxmlformats.org/officeDocument/2006/bibliography" SelectedStyle="\APASixthEditionOfficeOnline.xsl" StyleName="APA" Version="6"/>
+<file path=customXml/item3.xml><?xml version="1.0" encoding="utf-8"?>
+<?mso-contentType ?>
+<FormTemplates xmlns="http://schemas.microsoft.com/sharepoint/v3/contenttype/forms">
+  <Display>DocumentLibraryForm</Display>
+  <Edit>DocumentLibraryForm</Edit>
+  <New>DocumentLibraryForm</New>
+</FormTemplates>
 </file>
 
-<file path=customXml/item3.xml><?xml version="1.0" encoding="utf-8"?>
+<file path=customXml/item4.xml><?xml version="1.0" encoding="utf-8"?>
 <p:properties xmlns:p="http://schemas.microsoft.com/office/2006/metadata/properties" xmlns:xsi="http://www.w3.org/2001/XMLSchema-instance" xmlns:pc="http://schemas.microsoft.com/office/infopath/2007/PartnerControls">
   <documentManagement>
     <TaxCatchAll xmlns="adccf511-daff-4bcb-9072-914cedbf4c7e" xsi:nil="true"/>
@@ -40841,20 +40864,7 @@
 </p:properties>
 </file>
 
-<file path=customXml/item4.xml><?xml version="1.0" encoding="utf-8"?>
-<?mso-contentType ?>
-<FormTemplates xmlns="http://schemas.microsoft.com/sharepoint/v3/contenttype/forms">
-  <Display>DocumentLibraryForm</Display>
-  <Edit>DocumentLibraryForm</Edit>
-  <New>DocumentLibraryForm</New>
-</FormTemplates>
-</file>
-
 <file path=customXml/itemProps1.xml><?xml version="1.0" encoding="utf-8"?>
-<ds:datastoreItem xmlns:ds="http://schemas.openxmlformats.org/officeDocument/2006/customXml" ds:itemID="{D21921E3-315B-4818-9FA2-9DCBF286504E}"/>
-</file>
-
-<file path=customXml/itemProps2.xml><?xml version="1.0" encoding="utf-8"?>
 <ds:datastoreItem xmlns:ds="http://schemas.openxmlformats.org/officeDocument/2006/customXml" ds:itemID="{E8AB44A3-7C62-4BD2-82ED-8ABC209970FA}">
   <ds:schemaRefs>
     <ds:schemaRef ds:uri="http://schemas.openxmlformats.org/officeDocument/2006/bibliography"/>
@@ -40862,7 +40872,19 @@
 </ds:datastoreItem>
 </file>
 
+<file path=customXml/itemProps2.xml><?xml version="1.0" encoding="utf-8"?>
+<ds:datastoreItem xmlns:ds="http://schemas.openxmlformats.org/officeDocument/2006/customXml" ds:itemID="{8B6CD34B-773B-45B3-A17D-1BF6FE3410BD}"/>
+</file>
+
 <file path=customXml/itemProps3.xml><?xml version="1.0" encoding="utf-8"?>
+<ds:datastoreItem xmlns:ds="http://schemas.openxmlformats.org/officeDocument/2006/customXml" ds:itemID="{81CBDEC1-3B00-44ED-AD36-0268077980BA}">
+  <ds:schemaRefs>
+    <ds:schemaRef ds:uri="http://schemas.microsoft.com/sharepoint/v3/contenttype/forms"/>
+  </ds:schemaRefs>
+</ds:datastoreItem>
+</file>
+
+<file path=customXml/itemProps4.xml><?xml version="1.0" encoding="utf-8"?>
 <ds:datastoreItem xmlns:ds="http://schemas.openxmlformats.org/officeDocument/2006/customXml" ds:itemID="{6929C9FE-9F22-4B98-96EF-1B541B3BD0B2}">
   <ds:schemaRefs>
     <ds:schemaRef ds:uri="http://schemas.microsoft.com/office/2006/metadata/properties"/>
@@ -40871,12 +40893,4 @@
     <ds:schemaRef ds:uri="43a3ca16-9c26-4813-b83f-4aec9927b43f"/>
   </ds:schemaRefs>
 </ds:datastoreItem>
-</file>
-
-<file path=customXml/itemProps4.xml><?xml version="1.0" encoding="utf-8"?>
-<ds:datastoreItem xmlns:ds="http://schemas.openxmlformats.org/officeDocument/2006/customXml" ds:itemID="{81CBDEC1-3B00-44ED-AD36-0268077980BA}">
-  <ds:schemaRefs>
-    <ds:schemaRef ds:uri="http://schemas.microsoft.com/sharepoint/v3/contenttype/forms"/>
-  </ds:schemaRefs>
-</ds:datastoreItem>
 </file>
</xml_diff>